<commit_message>
Promote physical model v2 as the live advisory model
User-approved promotion (confirm.py retrain physical). New PhysicalModelV2 (120 s window, 117 features,
gradient-boosted classifier, threshold 0.788 at the 0.5/h budget) packaged as models/weights/physical_model_v2.joblib
via models/package_physical_v2.py; v1 weights untouched and kept as the fallback (IM_PHYSICAL_MODEL=v1).
Held-out SWaT test: P 0.461 R 0.513 F1 0.485, 8/10 segments, ROC-AUC 0.836 (v1: F1 0.306, 6/10).
PackedHistGB gives sklearn-identical inference at ~0.6 ms per assessment; live==training parity test.
PLC twin sensor noise is now on by default (a noiseless plant is out-of-distribution for the model).
Benchmarks, README, PROJECT_DETAILS and CLAUDE.md regenerated/updated.

Co-Authored-By: Claude Sonnet 5.5 <noreply@anthropic.com>
Claude-Session: https://claude.ai/code/session_01CCaa5ryDCYmdUxSsXWXtH1
</commit_message>
<xml_diff>
--- a/docs/PROJECT_DETAILS.docx
+++ b/docs/PROJECT_DETAILS.docx
@@ -2,7 +2,7 @@
 <file path=word/document.xml><?xml version="1.0" encoding="utf-8"?>
 <w:document xmlns:w="http://schemas.openxmlformats.org/wordprocessingml/2006/main" xmlns:m="http://schemas.openxmlformats.org/officeDocument/2006/math" xmlns:r="http://schemas.openxmlformats.org/officeDocument/2006/relationships" xmlns:o="urn:schemas-microsoft-com:office:office" xmlns:v="urn:schemas-microsoft-com:vml" xmlns:w10="urn:schemas-microsoft-com:office:word" xmlns:a="http://schemas.openxmlformats.org/drawingml/2006/main" xmlns:pic="http://schemas.openxmlformats.org/drawingml/2006/picture" xmlns:wp="http://schemas.openxmlformats.org/drawingml/2006/wordprocessingDrawing">
   <w:body>
-    <w:bookmarkStart w:id="86" w:name="Xe03ad410c3028613eb9ee7a520dd892489b5d33"/>
+    <w:bookmarkStart w:id="88" w:name="Xe03ad410c3028613eb9ee7a520dd892489b5d33"/>
     <w:p>
       <w:pPr>
         <w:pStyle w:val="Heading1"/>
@@ -1736,17 +1736,68 @@
               <w:jc w:val="left"/>
             </w:pPr>
             <w:r>
-              <w:t xml:space="preserve">Physical model</w:t>
-            </w:r>
-          </w:p>
-        </w:tc>
-        <w:tc>
-          <w:tcPr/>
-          <w:p>
-            <w:pPr>
-              <w:pStyle w:val="Compact"/>
-              <w:jc w:val="left"/>
-            </w:pPr>
+              <w:t xml:space="preserve">Physical model (live: v2; v1 kept as fallback)</w:t>
+            </w:r>
+          </w:p>
+        </w:tc>
+        <w:tc>
+          <w:tcPr/>
+          <w:p>
+            <w:pPr>
+              <w:pStyle w:val="Compact"/>
+              <w:jc w:val="left"/>
+            </w:pPr>
+            <w:r>
+              <w:rPr>
+                <w:rStyle w:val="VerbatimChar"/>
+              </w:rPr>
+              <w:t xml:space="preserve">models/physical_model_v2.py</w:t>
+            </w:r>
+            <w:r>
+              <w:t xml:space="preserve">,</w:t>
+            </w:r>
+            <w:r>
+              <w:t xml:space="preserve"> </w:t>
+            </w:r>
+            <w:r>
+              <w:rPr>
+                <w:rStyle w:val="VerbatimChar"/>
+              </w:rPr>
+              <w:t xml:space="preserve">swat/features_v2.py</w:t>
+            </w:r>
+            <w:r>
+              <w:t xml:space="preserve">,</w:t>
+            </w:r>
+            <w:r>
+              <w:t xml:space="preserve"> </w:t>
+            </w:r>
+            <w:r>
+              <w:rPr>
+                <w:rStyle w:val="VerbatimChar"/>
+              </w:rPr>
+              <w:t xml:space="preserve">swat/physical_features.py</w:t>
+            </w:r>
+            <w:r>
+              <w:t xml:space="preserve">,</w:t>
+            </w:r>
+            <w:r>
+              <w:t xml:space="preserve"> </w:t>
+            </w:r>
+            <w:r>
+              <w:rPr>
+                <w:rStyle w:val="VerbatimChar"/>
+              </w:rPr>
+              <w:t xml:space="preserve">models/tree_inference.py</w:t>
+            </w:r>
+            <w:r>
+              <w:t xml:space="preserve"> </w:t>
+            </w:r>
+            <w:r>
+              <w:t xml:space="preserve">(v1:</w:t>
+            </w:r>
+            <w:r>
+              <w:t xml:space="preserve"> </w:t>
+            </w:r>
             <w:r>
               <w:rPr>
                 <w:rStyle w:val="VerbatimChar"/>
@@ -1754,28 +1805,7 @@
               <w:t xml:space="preserve">models/physical_model.py</w:t>
             </w:r>
             <w:r>
-              <w:t xml:space="preserve">,</w:t>
-            </w:r>
-            <w:r>
-              <w:t xml:space="preserve"> </w:t>
-            </w:r>
-            <w:r>
-              <w:rPr>
-                <w:rStyle w:val="VerbatimChar"/>
-              </w:rPr>
-              <w:t xml:space="preserve">swat/physical_features.py</w:t>
-            </w:r>
-            <w:r>
-              <w:t xml:space="preserve">,</w:t>
-            </w:r>
-            <w:r>
-              <w:t xml:space="preserve"> </w:t>
-            </w:r>
-            <w:r>
-              <w:rPr>
-                <w:rStyle w:val="VerbatimChar"/>
-              </w:rPr>
-              <w:t xml:space="preserve">models/tree_inference.py</w:t>
+              <w:t xml:space="preserve">)</w:t>
             </w:r>
           </w:p>
         </w:tc>
@@ -1803,7 +1833,7 @@
               <w:jc w:val="left"/>
             </w:pPr>
             <w:r>
-              <w:t xml:space="preserve">anomaly and attack scoring of telemetry windows</w:t>
+              <w:t xml:space="preserve">attack probability of 120 s telemetry windows</w:t>
             </w:r>
           </w:p>
         </w:tc>
@@ -6492,7 +6522,7 @@
     </w:p>
     <w:bookmarkEnd w:id="43"/>
     <w:bookmarkEnd w:id="44"/>
-    <w:bookmarkStart w:id="72" w:name="components-in-depth"/>
+    <w:bookmarkStart w:id="73" w:name="components-in-depth"/>
     <w:p>
       <w:pPr>
         <w:pStyle w:val="Heading2"/>
@@ -9135,13 +9165,31 @@
     </w:p>
     <w:bookmarkEnd w:id="52"/>
     <w:bookmarkEnd w:id="53"/>
-    <w:bookmarkStart w:id="64" w:name="X81f5f2bccaa10cd3ac7e9ab51f1062c06fcde01"/>
+    <w:bookmarkStart w:id="65" w:name="Xbd2f2bc9bac96a27ff8c25ea0bfe54ea9a80822"/>
     <w:p>
       <w:pPr>
         <w:pStyle w:val="Heading3"/>
       </w:pPr>
       <w:r>
-        <w:t xml:space="preserve">7.5 Physical model: the only learned model in use (</w:t>
+        <w:t xml:space="preserve">7.5 Physical model: the only learned model in use</w:t>
+      </w:r>
+    </w:p>
+    <w:p>
+      <w:pPr>
+        <w:pStyle w:val="FirstParagraph"/>
+      </w:pPr>
+      <w:r>
+        <w:rPr>
+          <w:bCs/>
+          <w:b/>
+        </w:rPr>
+        <w:t xml:space="preserve">The live model is v2 (section 7.5.11).</w:t>
+      </w:r>
+      <w:r>
+        <w:t xml:space="preserve"> </w:t>
+      </w:r>
+      <w:r>
+        <w:t xml:space="preserve">Sections 7.5.1 to 7.5.10 describe the v1 model (</w:t>
       </w:r>
       <w:r>
         <w:rPr>
@@ -9150,12 +9198,24 @@
         <w:t xml:space="preserve">models/physical_model.py</w:t>
       </w:r>
       <w:r>
-        <w:t xml:space="preserve">)</w:t>
-      </w:r>
-    </w:p>
-    <w:p>
-      <w:pPr>
-        <w:pStyle w:val="FirstParagraph"/>
+        <w:t xml:space="preserve">), which shares the window, decimation and failure-handling machinery with v2, remains in the repository and is selectable with</w:t>
+      </w:r>
+      <w:r>
+        <w:t xml:space="preserve"> </w:t>
+      </w:r>
+      <w:r>
+        <w:rPr>
+          <w:rStyle w:val="VerbatimChar"/>
+        </w:rPr>
+        <w:t xml:space="preserve">IM_PHYSICAL_MODEL=v1</w:t>
+      </w:r>
+      <w:r>
+        <w:t xml:space="preserve">, and is the fallback if the v2 weights cannot be loaded.</w:t>
+      </w:r>
+    </w:p>
+    <w:p>
+      <w:pPr>
+        <w:pStyle w:val="BodyText"/>
       </w:pPr>
       <w:r>
         <w:rPr>
@@ -10810,8 +10870,413 @@
       </w:r>
     </w:p>
     <w:bookmarkEnd w:id="63"/>
+    <w:bookmarkStart w:id="64" w:name="Xc782cf0149a55cc61679ed21d3c01de0fedaa2f"/>
+    <w:p>
+      <w:pPr>
+        <w:pStyle w:val="Heading4"/>
+      </w:pPr>
+      <w:r>
+        <w:t xml:space="preserve">7.5.11 Promoted model v2 (</w:t>
+      </w:r>
+      <w:r>
+        <w:rPr>
+          <w:rStyle w:val="VerbatimChar"/>
+        </w:rPr>
+        <w:t xml:space="preserve">models/physical_model_v2.py</w:t>
+      </w:r>
+      <w:r>
+        <w:t xml:space="preserve">,</w:t>
+      </w:r>
+      <w:r>
+        <w:t xml:space="preserve"> </w:t>
+      </w:r>
+      <w:r>
+        <w:rPr>
+          <w:rStyle w:val="VerbatimChar"/>
+        </w:rPr>
+        <w:t xml:space="preserve">swat/features_v2.py</w:t>
+      </w:r>
+      <w:r>
+        <w:t xml:space="preserve">,</w:t>
+      </w:r>
+      <w:r>
+        <w:t xml:space="preserve"> </w:t>
+      </w:r>
+      <w:r>
+        <w:rPr>
+          <w:rStyle w:val="VerbatimChar"/>
+        </w:rPr>
+        <w:t xml:space="preserve">models/train_physical_v2.py</w:t>
+      </w:r>
+      <w:r>
+        <w:t xml:space="preserve">)</w:t>
+      </w:r>
+    </w:p>
+    <w:p>
+      <w:pPr>
+        <w:numPr>
+          <w:ilvl w:val="0"/>
+          <w:numId w:val="1011"/>
+        </w:numPr>
+        <w:pStyle w:val="Compact"/>
+      </w:pPr>
+      <w:r>
+        <w:rPr>
+          <w:bCs/>
+          <w:b/>
+        </w:rPr>
+        <w:t xml:space="preserve">What changed versus v1:</w:t>
+      </w:r>
+      <w:r>
+        <w:t xml:space="preserve"> </w:t>
+      </w:r>
+      <w:r>
+        <w:t xml:space="preserve">(1) it is fitted on train</w:t>
+      </w:r>
+      <w:r>
+        <w:t xml:space="preserve"> </w:t>
+      </w:r>
+      <w:r>
+        <w:rPr>
+          <w:bCs/>
+          <w:b/>
+        </w:rPr>
+        <w:t xml:space="preserve">and</w:t>
+      </w:r>
+      <w:r>
+        <w:t xml:space="preserve"> </w:t>
+      </w:r>
+      <w:r>
+        <w:t xml:space="preserve">validation windows; (2) a</w:t>
+      </w:r>
+      <w:r>
+        <w:t xml:space="preserve"> </w:t>
+      </w:r>
+      <w:r>
+        <w:rPr>
+          <w:bCs/>
+          <w:b/>
+        </w:rPr>
+        <w:t xml:space="preserve">120 s</w:t>
+      </w:r>
+      <w:r>
+        <w:t xml:space="preserve"> </w:t>
+      </w:r>
+      <w:r>
+        <w:t xml:space="preserve">history (1 Hz) replaces the 30 s window; (3) two feature groups are added to the 67 drift-robust v1 statistics (computed over the last 30 s):</w:t>
+      </w:r>
+      <w:r>
+        <w:t xml:space="preserve"> </w:t>
+      </w:r>
+      <w:r>
+        <w:rPr>
+          <w:bCs/>
+          <w:b/>
+        </w:rPr>
+        <w:t xml:space="preserve">long-context features</w:t>
+      </w:r>
+      <w:r>
+        <w:t xml:space="preserve"> </w:t>
+      </w:r>
+      <w:r>
+        <w:t xml:space="preserve">over the full 120 s (per sensor: slope, standard deviation, net change; per actuator: number of toggles) and</w:t>
+      </w:r>
+      <w:r>
+        <w:t xml:space="preserve"> </w:t>
+      </w:r>
+      <w:r>
+        <w:rPr>
+          <w:bCs/>
+          <w:b/>
+        </w:rPr>
+        <w:t xml:space="preserve">cross-sensor consistency residuals</w:t>
+      </w:r>
+      <w:r>
+        <w:t xml:space="preserve">; (4) the two heads are replaced by</w:t>
+      </w:r>
+      <w:r>
+        <w:t xml:space="preserve"> </w:t>
+      </w:r>
+      <w:r>
+        <w:rPr>
+          <w:bCs/>
+          <w:b/>
+        </w:rPr>
+        <w:t xml:space="preserve">one gradient-boosted classifier</w:t>
+      </w:r>
+      <w:r>
+        <w:t xml:space="preserve"> </w:t>
+      </w:r>
+      <w:r>
+        <w:t xml:space="preserve">(</w:t>
+      </w:r>
+      <w:r>
+        <w:rPr>
+          <w:rStyle w:val="VerbatimChar"/>
+        </w:rPr>
+        <w:t xml:space="preserve">HistGradientBoostingClassifier</w:t>
+      </w:r>
+      <w:r>
+        <w:t xml:space="preserve">), so there is no Isolation Forest and</w:t>
+      </w:r>
+      <w:r>
+        <w:t xml:space="preserve"> </w:t>
+      </w:r>
+      <w:r>
+        <w:rPr>
+          <w:rStyle w:val="VerbatimChar"/>
+        </w:rPr>
+        <w:t xml:space="preserve">anomaly_score</w:t>
+      </w:r>
+      <w:r>
+        <w:t xml:space="preserve"> </w:t>
+      </w:r>
+      <w:r>
+        <w:t xml:space="preserve">is</w:t>
+      </w:r>
+      <w:r>
+        <w:t xml:space="preserve"> </w:t>
+      </w:r>
+      <w:r>
+        <w:rPr>
+          <w:rStyle w:val="VerbatimChar"/>
+        </w:rPr>
+        <w:t xml:space="preserve">None</w:t>
+      </w:r>
+      <w:r>
+        <w:t xml:space="preserve">; (5) the model and threshold are chosen by</w:t>
+      </w:r>
+      <w:r>
+        <w:t xml:space="preserve"> </w:t>
+      </w:r>
+      <w:r>
+        <w:rPr>
+          <w:bCs/>
+          <w:b/>
+        </w:rPr>
+        <w:t xml:space="preserve">segment-grouped 5-fold cross-validation</w:t>
+      </w:r>
+      <w:r>
+        <w:t xml:space="preserve"> </w:t>
+      </w:r>
+      <w:r>
+        <w:t xml:space="preserve">with segment-balanced average precision, so that one long attack segment cannot dominate the choice.</w:t>
+      </w:r>
+    </w:p>
+    <w:p>
+      <w:pPr>
+        <w:numPr>
+          <w:ilvl w:val="0"/>
+          <w:numId w:val="1011"/>
+        </w:numPr>
+        <w:pStyle w:val="Compact"/>
+      </w:pPr>
+      <w:r>
+        <w:rPr>
+          <w:bCs/>
+          <w:b/>
+        </w:rPr>
+        <w:t xml:space="preserve">Residual features:</w:t>
+      </w:r>
+      <w:r>
+        <w:t xml:space="preserve"> </w:t>
+      </w:r>
+      <w:r>
+        <w:t xml:space="preserve">for each sensor a ridge regression (alpha 10) predicts its 30 s trend (z-scored slope) from the other sensors’ window means and the actuators’ on-fractions. It is fitted on</w:t>
+      </w:r>
+      <w:r>
+        <w:t xml:space="preserve"> </w:t>
+      </w:r>
+      <w:r>
+        <w:rPr>
+          <w:bCs/>
+          <w:b/>
+        </w:rPr>
+        <w:t xml:space="preserve">normal windows only</w:t>
+      </w:r>
+      <w:r>
+        <w:t xml:space="preserve">; at run time the standardised prediction error of every sensor (plus the maximum and mean absolute error) is a feature. A physical relationship that breaks (a level that does not follow the flows) makes the residual grow. 117 features in total.</w:t>
+      </w:r>
+    </w:p>
+    <w:p>
+      <w:pPr>
+        <w:numPr>
+          <w:ilvl w:val="0"/>
+          <w:numId w:val="1011"/>
+        </w:numPr>
+        <w:pStyle w:val="Compact"/>
+      </w:pPr>
+      <w:r>
+        <w:rPr>
+          <w:bCs/>
+          <w:b/>
+        </w:rPr>
+        <w:t xml:space="preserve">Decision:</w:t>
+      </w:r>
+      <w:r>
+        <w:t xml:space="preserve"> </w:t>
+      </w:r>
+      <w:r>
+        <w:rPr>
+          <w:rStyle w:val="VerbatimChar"/>
+        </w:rPr>
+        <w:t xml:space="preserve">threat_flag = attack_probability &gt; 0.7880</w:t>
+      </w:r>
+      <w:r>
+        <w:t xml:space="preserve">. The threshold is the out-of-fold development threshold for a false-alarm budget of</w:t>
+      </w:r>
+      <w:r>
+        <w:t xml:space="preserve"> </w:t>
+      </w:r>
+      <w:r>
+        <w:rPr>
+          <w:bCs/>
+          <w:b/>
+        </w:rPr>
+        <w:t xml:space="preserve">0.5 episodes per benign hour</w:t>
+      </w:r>
+      <w:r>
+        <w:t xml:space="preserve">. A</w:t>
+      </w:r>
+      <w:r>
+        <w:t xml:space="preserve"> </w:t>
+      </w:r>
+      <w:r>
+        <w:t xml:space="preserve">“</w:t>
+      </w:r>
+      <w:r>
+        <w:t xml:space="preserve">k of the last m windows</w:t>
+      </w:r>
+      <w:r>
+        <w:t xml:space="preserve">”</w:t>
+      </w:r>
+      <w:r>
+        <w:t xml:space="preserve"> </w:t>
+      </w:r>
+      <w:r>
+        <w:t xml:space="preserve">persistence rule was evaluated and made F1 worse on the held-out block (0.416 against 0.485), so it is not used.</w:t>
+      </w:r>
+    </w:p>
+    <w:p>
+      <w:pPr>
+        <w:numPr>
+          <w:ilvl w:val="0"/>
+          <w:numId w:val="1011"/>
+        </w:numPr>
+        <w:pStyle w:val="Compact"/>
+      </w:pPr>
+      <w:r>
+        <w:rPr>
+          <w:bCs/>
+          <w:b/>
+        </w:rPr>
+        <w:t xml:space="preserve">Live inference:</w:t>
+      </w:r>
+      <w:r>
+        <w:t xml:space="preserve"> </w:t>
+      </w:r>
+      <w:r>
+        <w:t xml:space="preserve">the same feature functions the trainer calls build the 117 features from the live window (checked to 1e-9 against training in</w:t>
+      </w:r>
+      <w:r>
+        <w:t xml:space="preserve"> </w:t>
+      </w:r>
+      <w:r>
+        <w:rPr>
+          <w:rStyle w:val="VerbatimChar"/>
+        </w:rPr>
+        <w:t xml:space="preserve">tests/test_physical_v2_live.py</w:t>
+      </w:r>
+      <w:r>
+        <w:t xml:space="preserve">);</w:t>
+      </w:r>
+      <w:r>
+        <w:t xml:space="preserve"> </w:t>
+      </w:r>
+      <w:r>
+        <w:rPr>
+          <w:rStyle w:val="VerbatimChar"/>
+        </w:rPr>
+        <w:t xml:space="preserve">PackedHistGB</w:t>
+      </w:r>
+      <w:r>
+        <w:t xml:space="preserve"> </w:t>
+      </w:r>
+      <w:r>
+        <w:t xml:space="preserve">evaluates all 150 trees with numpy (identical to scikit-learn to 1e-15, about 0.05 ms against 1.6 ms), so one assessment costs about 0.6 ms including the features. Warm-up is 120 s. Failure handling is as in 7.5.10 (abstain, never raise).</w:t>
+      </w:r>
+    </w:p>
+    <w:p>
+      <w:pPr>
+        <w:numPr>
+          <w:ilvl w:val="0"/>
+          <w:numId w:val="1011"/>
+        </w:numPr>
+        <w:pStyle w:val="Compact"/>
+      </w:pPr>
+      <w:r>
+        <w:rPr>
+          <w:bCs/>
+          <w:b/>
+        </w:rPr>
+        <w:t xml:space="preserve">Why the twin must be noisy:</w:t>
+      </w:r>
+      <w:r>
+        <w:t xml:space="preserve"> </w:t>
+      </w:r>
+      <w:r>
+        <w:t xml:space="preserve">SWaT sensors are noisy; a perfectly flat, noiseless plant is out-of-distribution (constant standard deviations of zero) and made the model sit at p = 0.84 in ALERT. The PLC therefore runs the twin with sensor noise by default (</w:t>
+      </w:r>
+      <w:r>
+        <w:rPr>
+          <w:rStyle w:val="VerbatimChar"/>
+        </w:rPr>
+        <w:t xml:space="preserve">IM_TWIN_NOISE=0</w:t>
+      </w:r>
+      <w:r>
+        <w:t xml:space="preserve"> </w:t>
+      </w:r>
+      <w:r>
+        <w:t xml:space="preserve">turns it off); with noise the healthy twin shows</w:t>
+      </w:r>
+      <w:r>
+        <w:t xml:space="preserve"> </w:t>
+      </w:r>
+      <w:r>
+        <w:rPr>
+          <w:rStyle w:val="VerbatimChar"/>
+        </w:rPr>
+        <w:t xml:space="preserve">NORMAL</w:t>
+      </w:r>
+      <w:r>
+        <w:t xml:space="preserve">, probability about 0.03.</w:t>
+      </w:r>
+    </w:p>
+    <w:p>
+      <w:pPr>
+        <w:numPr>
+          <w:ilvl w:val="0"/>
+          <w:numId w:val="1011"/>
+        </w:numPr>
+        <w:pStyle w:val="Compact"/>
+      </w:pPr>
+      <w:r>
+        <w:rPr>
+          <w:bCs/>
+          <w:b/>
+        </w:rPr>
+        <w:t xml:space="preserve">Measured results (held-out test block, 0.5 budget):</w:t>
+      </w:r>
+      <w:r>
+        <w:t xml:space="preserve"> </w:t>
+      </w:r>
+      <w:r>
+        <w:t xml:space="preserve">section 8.1b.</w:t>
+      </w:r>
+    </w:p>
     <w:bookmarkEnd w:id="64"/>
-    <w:bookmarkStart w:id="65" w:name="Xd22f8c46f470b649354f8224f4ea357bd3f719b"/>
+    <w:bookmarkEnd w:id="65"/>
+    <w:bookmarkStart w:id="66" w:name="Xd22f8c46f470b649354f8224f4ea357bd3f719b"/>
     <w:p>
       <w:pPr>
         <w:pStyle w:val="Heading3"/>
@@ -11110,8 +11575,8 @@
         <w:t xml:space="preserve">. Dropped for honest reasons, not hidden.</w:t>
       </w:r>
     </w:p>
-    <w:bookmarkEnd w:id="65"/>
-    <w:bookmarkStart w:id="66" w:name="X39d12aa378c2a334de274933bcb7e82960732d9"/>
+    <w:bookmarkEnd w:id="66"/>
+    <w:bookmarkStart w:id="67" w:name="X39d12aa378c2a334de274933bcb7e82960732d9"/>
     <w:p>
       <w:pPr>
         <w:pStyle w:val="Heading3"/>
@@ -11761,8 +12226,8 @@
         <w:t xml:space="preserve">.)</w:t>
       </w:r>
     </w:p>
-    <w:bookmarkEnd w:id="66"/>
-    <w:bookmarkStart w:id="67" w:name="pipeline-pipelinemulti_model_pipeline.py"/>
+    <w:bookmarkEnd w:id="67"/>
+    <w:bookmarkStart w:id="68" w:name="pipeline-pipelinemulti_model_pipeline.py"/>
     <w:p>
       <w:pPr>
         <w:pStyle w:val="Heading3"/>
@@ -11825,8 +12290,8 @@
         <w:t xml:space="preserve">(which never raises). Failures follow the policy in 3.3.</w:t>
       </w:r>
     </w:p>
-    <w:bookmarkEnd w:id="67"/>
-    <w:bookmarkStart w:id="68" w:name="packet-tracer-middlewaretrace.py"/>
+    <w:bookmarkEnd w:id="68"/>
+    <w:bookmarkStart w:id="69" w:name="packet-tracer-middlewaretrace.py"/>
     <w:p>
       <w:pPr>
         <w:pStyle w:val="Heading3"/>
@@ -12096,8 +12561,8 @@
         <w:t xml:space="preserve">automates it).</w:t>
       </w:r>
     </w:p>
-    <w:bookmarkEnd w:id="68"/>
-    <w:bookmarkStart w:id="69" w:name="dashboard-dashboardapp.py-flask"/>
+    <w:bookmarkEnd w:id="69"/>
+    <w:bookmarkStart w:id="70" w:name="dashboard-dashboardapp.py-flask"/>
     <w:p>
       <w:pPr>
         <w:pStyle w:val="Heading3"/>
@@ -12341,8 +12806,8 @@
         <w:t xml:space="preserve">) with a stable mapping.</w:t>
       </w:r>
     </w:p>
-    <w:bookmarkEnd w:id="69"/>
-    <w:bookmarkStart w:id="70" w:name="attack-log-docsattack_log.py"/>
+    <w:bookmarkEnd w:id="70"/>
+    <w:bookmarkStart w:id="71" w:name="attack-log-docsattack_log.py"/>
     <w:p>
       <w:pPr>
         <w:pStyle w:val="Heading3"/>
@@ -12441,8 +12906,8 @@
         <w:t xml:space="preserve">, never from anything the sender claims. The HMAC key and tag are never written.</w:t>
       </w:r>
     </w:p>
-    <w:bookmarkEnd w:id="70"/>
-    <w:bookmarkStart w:id="71" w:name="X9e0668d551acf2c9ee39edee112a3eba08a51e6"/>
+    <w:bookmarkEnd w:id="71"/>
+    <w:bookmarkStart w:id="72" w:name="X9e0668d551acf2c9ee39edee112a3eba08a51e6"/>
     <w:p>
       <w:pPr>
         <w:pStyle w:val="Heading3"/>
@@ -13091,9 +13556,9 @@
         </w:pict>
       </w:r>
     </w:p>
-    <w:bookmarkEnd w:id="71"/>
     <w:bookmarkEnd w:id="72"/>
-    <w:bookmarkStart w:id="78" w:name="evaluation-and-results"/>
+    <w:bookmarkEnd w:id="73"/>
+    <w:bookmarkStart w:id="80" w:name="evaluation-and-results"/>
     <w:p>
       <w:pPr>
         <w:pStyle w:val="Heading2"/>
@@ -13120,13 +13585,13 @@
         <w:t xml:space="preserve">Do not pool them.</w:t>
       </w:r>
     </w:p>
-    <w:bookmarkStart w:id="73" w:name="Xfa99010df7cd8dd621786303d7f2bb37f21da2f"/>
+    <w:bookmarkStart w:id="74" w:name="X79126b2b0a4b35a0bae76559ff716fc9a80e2f3"/>
     <w:p>
       <w:pPr>
         <w:pStyle w:val="Heading3"/>
       </w:pPr>
       <w:r>
-        <w:t xml:space="preserve">8.1 Real data: held-out SWaT test block (physical model, advisory)</w:t>
+        <w:t xml:space="preserve">8.1 Real data: held-out SWaT test block (physical model v1, advisory; superseded by v2, section 8.1b)</w:t>
       </w:r>
     </w:p>
     <w:p>
@@ -13779,7 +14244,7 @@
       <w:pPr>
         <w:numPr>
           <w:ilvl w:val="0"/>
-          <w:numId w:val="1011"/>
+          <w:numId w:val="1012"/>
         </w:numPr>
         <w:pStyle w:val="Compact"/>
       </w:pPr>
@@ -13798,7 +14263,7 @@
       <w:pPr>
         <w:numPr>
           <w:ilvl w:val="0"/>
-          <w:numId w:val="1011"/>
+          <w:numId w:val="1012"/>
         </w:numPr>
         <w:pStyle w:val="Compact"/>
       </w:pPr>
@@ -13817,7 +14282,7 @@
       <w:pPr>
         <w:numPr>
           <w:ilvl w:val="0"/>
-          <w:numId w:val="1011"/>
+          <w:numId w:val="1012"/>
         </w:numPr>
         <w:pStyle w:val="Compact"/>
       </w:pPr>
@@ -13855,7 +14320,7 @@
       <w:pPr>
         <w:numPr>
           <w:ilvl w:val="0"/>
-          <w:numId w:val="1011"/>
+          <w:numId w:val="1012"/>
         </w:numPr>
         <w:pStyle w:val="Compact"/>
       </w:pPr>
@@ -13867,7 +14332,7 @@
       <w:pPr>
         <w:numPr>
           <w:ilvl w:val="0"/>
-          <w:numId w:val="1011"/>
+          <w:numId w:val="1012"/>
         </w:numPr>
         <w:pStyle w:val="Compact"/>
       </w:pPr>
@@ -13889,7 +14354,7 @@
       <w:pPr>
         <w:numPr>
           <w:ilvl w:val="0"/>
-          <w:numId w:val="1011"/>
+          <w:numId w:val="1012"/>
         </w:numPr>
         <w:pStyle w:val="Compact"/>
       </w:pPr>
@@ -13898,7 +14363,7 @@
           <w:bCs/>
           <w:b/>
         </w:rPr>
-        <w:t xml:space="preserve">Honest reading:</w:t>
+        <w:t xml:space="preserve">Honest reading (v1):</w:t>
       </w:r>
       <w:r>
         <w:t xml:space="preserve"> </w:t>
@@ -13927,7 +14392,7 @@
       <w:pPr>
         <w:numPr>
           <w:ilvl w:val="0"/>
-          <w:numId w:val="1011"/>
+          <w:numId w:val="1012"/>
         </w:numPr>
         <w:pStyle w:val="Compact"/>
       </w:pPr>
@@ -13953,8 +14418,864 @@
         <w:t xml:space="preserve">baseline precision 0.038, recall 1.0, F1 0.073.</w:t>
       </w:r>
     </w:p>
-    <w:bookmarkEnd w:id="73"/>
-    <w:bookmarkStart w:id="74" w:name="Xcd30e8a97f8e88412e5a486c430b11a89b3dd71"/>
+    <w:bookmarkEnd w:id="74"/>
+    <w:bookmarkStart w:id="75" w:name="X873b48addaaeb3a526add6cb20bad3af3a93300"/>
+    <w:p>
+      <w:pPr>
+        <w:pStyle w:val="Heading3"/>
+      </w:pPr>
+      <w:r>
+        <w:t xml:space="preserve">8.1b Real data: the promoted v2 model on the same held-out block</w:t>
+      </w:r>
+    </w:p>
+    <w:p>
+      <w:pPr>
+        <w:pStyle w:val="FirstParagraph"/>
+      </w:pPr>
+      <w:r>
+        <w:t xml:space="preserve">Test block 1-2 Jan 2016: 28,080 windows (each with a full 120 s history), 1,061 attack, 37.53 benign hours. Source:</w:t>
+      </w:r>
+      <w:r>
+        <w:t xml:space="preserve"> </w:t>
+      </w:r>
+      <w:r>
+        <w:rPr>
+          <w:rStyle w:val="VerbatimChar"/>
+        </w:rPr>
+        <w:t xml:space="preserve">docs/reports/physical_training_report_v2_swat.md</w:t>
+      </w:r>
+      <w:r>
+        <w:t xml:space="preserve"> </w:t>
+      </w:r>
+      <w:r>
+        <w:t xml:space="preserve">(the user’s local SWaT run of</w:t>
+      </w:r>
+      <w:r>
+        <w:t xml:space="preserve"> </w:t>
+      </w:r>
+      <w:r>
+        <w:rPr>
+          <w:rStyle w:val="VerbatimChar"/>
+        </w:rPr>
+        <w:t xml:space="preserve">models/train_physical_v2.py</w:t>
+      </w:r>
+      <w:r>
+        <w:t xml:space="preserve">). The test block was used for exactly two refits and looks (baseline and selected) and had been seen by v1’s revised protocol: held-out, not blind.</w:t>
+      </w:r>
+    </w:p>
+    <w:p>
+      <w:pPr>
+        <w:pStyle w:val="BodyText"/>
+      </w:pPr>
+      <w:r>
+        <w:rPr>
+          <w:bCs/>
+          <w:b/>
+        </w:rPr>
+        <w:t xml:space="preserve">Confusion matrix of the advisory flag (threshold 0.788):</w:t>
+      </w:r>
+      <w:r>
+        <w:t xml:space="preserve"> </w:t>
+      </w:r>
+      <w:r>
+        <w:t xml:space="preserve">TN 26,382, FP 637, FN 517, TP 544.</w:t>
+      </w:r>
+    </w:p>
+    <w:tbl>
+      <w:tblPr>
+        <w:tblStyle w:val="Table"/>
+        <w:tblW w:type="pct" w:w="5000"/>
+        <w:tblLook w:firstRow="1" w:lastRow="0" w:firstColumn="0" w:lastColumn="0" w:noHBand="0" w:noVBand="0" w:val="0020"/>
+        <w:jc w:val="start"/>
+      </w:tblPr>
+      <w:tblGrid>
+        <w:gridCol w:w="792"/>
+        <w:gridCol w:w="792"/>
+        <w:gridCol w:w="792"/>
+        <w:gridCol w:w="792"/>
+        <w:gridCol w:w="792"/>
+        <w:gridCol w:w="792"/>
+        <w:gridCol w:w="792"/>
+        <w:gridCol w:w="792"/>
+        <w:gridCol w:w="792"/>
+        <w:gridCol w:w="792"/>
+      </w:tblGrid>
+      <w:tr>
+        <w:trPr>
+          <w:tblHeader w:val="true"/>
+        </w:trPr>
+        <w:tc>
+          <w:tcPr/>
+          <w:p>
+            <w:pPr>
+              <w:pStyle w:val="Compact"/>
+              <w:jc w:val="left"/>
+            </w:pPr>
+            <w:r>
+              <w:t xml:space="preserve">Variant (budget 0.5 per benign hour)</w:t>
+            </w:r>
+          </w:p>
+        </w:tc>
+        <w:tc>
+          <w:tcPr/>
+          <w:p>
+            <w:pPr>
+              <w:pStyle w:val="Compact"/>
+              <w:jc w:val="left"/>
+            </w:pPr>
+            <w:r>
+              <w:t xml:space="preserve">Precision</w:t>
+            </w:r>
+          </w:p>
+        </w:tc>
+        <w:tc>
+          <w:tcPr/>
+          <w:p>
+            <w:pPr>
+              <w:pStyle w:val="Compact"/>
+              <w:jc w:val="left"/>
+            </w:pPr>
+            <w:r>
+              <w:t xml:space="preserve">Recall</w:t>
+            </w:r>
+          </w:p>
+        </w:tc>
+        <w:tc>
+          <w:tcPr/>
+          <w:p>
+            <w:pPr>
+              <w:pStyle w:val="Compact"/>
+              <w:jc w:val="left"/>
+            </w:pPr>
+            <w:r>
+              <w:t xml:space="preserve">F1</w:t>
+            </w:r>
+          </w:p>
+        </w:tc>
+        <w:tc>
+          <w:tcPr/>
+          <w:p>
+            <w:pPr>
+              <w:pStyle w:val="Compact"/>
+              <w:jc w:val="left"/>
+            </w:pPr>
+            <w:r>
+              <w:t xml:space="preserve">Accuracy</w:t>
+            </w:r>
+          </w:p>
+        </w:tc>
+        <w:tc>
+          <w:tcPr/>
+          <w:p>
+            <w:pPr>
+              <w:pStyle w:val="Compact"/>
+              <w:jc w:val="left"/>
+            </w:pPr>
+            <w:r>
+              <w:t xml:space="preserve">Balanced acc.</w:t>
+            </w:r>
+          </w:p>
+        </w:tc>
+        <w:tc>
+          <w:tcPr/>
+          <w:p>
+            <w:pPr>
+              <w:pStyle w:val="Compact"/>
+              <w:jc w:val="left"/>
+            </w:pPr>
+            <w:r>
+              <w:t xml:space="preserve">FP rate</w:t>
+            </w:r>
+          </w:p>
+        </w:tc>
+        <w:tc>
+          <w:tcPr/>
+          <w:p>
+            <w:pPr>
+              <w:pStyle w:val="Compact"/>
+              <w:jc w:val="left"/>
+            </w:pPr>
+            <w:r>
+              <w:t xml:space="preserve">Alarm episodes / h</w:t>
+            </w:r>
+          </w:p>
+        </w:tc>
+        <w:tc>
+          <w:tcPr/>
+          <w:p>
+            <w:pPr>
+              <w:pStyle w:val="Compact"/>
+              <w:jc w:val="left"/>
+            </w:pPr>
+            <w:r>
+              <w:t xml:space="preserve">Segments</w:t>
+            </w:r>
+          </w:p>
+        </w:tc>
+        <w:tc>
+          <w:tcPr/>
+          <w:p>
+            <w:pPr>
+              <w:pStyle w:val="Compact"/>
+              <w:jc w:val="left"/>
+            </w:pPr>
+            <w:r>
+              <w:t xml:space="preserve">ROC-AUC</w:t>
+            </w:r>
+          </w:p>
+        </w:tc>
+      </w:tr>
+      <w:tr>
+        <w:tc>
+          <w:tcPr/>
+          <w:p>
+            <w:pPr>
+              <w:pStyle w:val="Compact"/>
+              <w:jc w:val="left"/>
+            </w:pPr>
+            <w:r>
+              <w:t xml:space="preserve">v1 (shipped before; 1,060 attack windows)</w:t>
+            </w:r>
+          </w:p>
+        </w:tc>
+        <w:tc>
+          <w:tcPr/>
+          <w:p>
+            <w:pPr>
+              <w:pStyle w:val="Compact"/>
+              <w:jc w:val="left"/>
+            </w:pPr>
+            <w:r>
+              <w:t xml:space="preserve">0.366</w:t>
+            </w:r>
+          </w:p>
+        </w:tc>
+        <w:tc>
+          <w:tcPr/>
+          <w:p>
+            <w:pPr>
+              <w:pStyle w:val="Compact"/>
+              <w:jc w:val="left"/>
+            </w:pPr>
+            <w:r>
+              <w:t xml:space="preserve">0.263</w:t>
+            </w:r>
+          </w:p>
+        </w:tc>
+        <w:tc>
+          <w:tcPr/>
+          <w:p>
+            <w:pPr>
+              <w:pStyle w:val="Compact"/>
+              <w:jc w:val="left"/>
+            </w:pPr>
+            <w:r>
+              <w:t xml:space="preserve">0.306</w:t>
+            </w:r>
+          </w:p>
+        </w:tc>
+        <w:tc>
+          <w:tcPr/>
+          <w:p>
+            <w:pPr>
+              <w:pStyle w:val="Compact"/>
+              <w:jc w:val="left"/>
+            </w:pPr>
+            <w:r>
+              <w:t xml:space="preserve">0.955</w:t>
+            </w:r>
+          </w:p>
+        </w:tc>
+        <w:tc>
+          <w:tcPr/>
+          <w:p>
+            <w:pPr>
+              <w:pStyle w:val="Compact"/>
+              <w:jc w:val="left"/>
+            </w:pPr>
+            <w:r>
+              <w:t xml:space="preserve">0.623</w:t>
+            </w:r>
+          </w:p>
+        </w:tc>
+        <w:tc>
+          <w:tcPr/>
+          <w:p>
+            <w:pPr>
+              <w:pStyle w:val="Compact"/>
+              <w:jc w:val="left"/>
+            </w:pPr>
+            <w:r>
+              <w:t xml:space="preserve">0.018</w:t>
+            </w:r>
+          </w:p>
+        </w:tc>
+        <w:tc>
+          <w:tcPr/>
+          <w:p>
+            <w:pPr>
+              <w:pStyle w:val="Compact"/>
+              <w:jc w:val="left"/>
+            </w:pPr>
+            <w:r>
+              <w:t xml:space="preserve">1.79</w:t>
+            </w:r>
+          </w:p>
+        </w:tc>
+        <w:tc>
+          <w:tcPr/>
+          <w:p>
+            <w:pPr>
+              <w:pStyle w:val="Compact"/>
+              <w:jc w:val="left"/>
+            </w:pPr>
+            <w:r>
+              <w:t xml:space="preserve">6/10</w:t>
+            </w:r>
+          </w:p>
+        </w:tc>
+        <w:tc>
+          <w:tcPr/>
+          <w:p>
+            <w:pPr>
+              <w:pStyle w:val="Compact"/>
+              <w:jc w:val="left"/>
+            </w:pPr>
+            <w:r>
+              <w:t xml:space="preserve">0.825</w:t>
+            </w:r>
+          </w:p>
+        </w:tc>
+      </w:tr>
+      <w:tr>
+        <w:tc>
+          <w:tcPr/>
+          <w:p>
+            <w:pPr>
+              <w:pStyle w:val="Compact"/>
+              <w:jc w:val="left"/>
+            </w:pPr>
+            <w:r>
+              <w:t xml:space="preserve">refit baseline (v1 features, random forest, train + validation)</w:t>
+            </w:r>
+          </w:p>
+        </w:tc>
+        <w:tc>
+          <w:tcPr/>
+          <w:p>
+            <w:pPr>
+              <w:pStyle w:val="Compact"/>
+              <w:jc w:val="left"/>
+            </w:pPr>
+            <w:r>
+              <w:t xml:space="preserve">0.453</w:t>
+            </w:r>
+          </w:p>
+        </w:tc>
+        <w:tc>
+          <w:tcPr/>
+          <w:p>
+            <w:pPr>
+              <w:pStyle w:val="Compact"/>
+              <w:jc w:val="left"/>
+            </w:pPr>
+            <w:r>
+              <w:t xml:space="preserve">0.499</w:t>
+            </w:r>
+          </w:p>
+        </w:tc>
+        <w:tc>
+          <w:tcPr/>
+          <w:p>
+            <w:pPr>
+              <w:pStyle w:val="Compact"/>
+              <w:jc w:val="left"/>
+            </w:pPr>
+            <w:r>
+              <w:t xml:space="preserve">0.474</w:t>
+            </w:r>
+          </w:p>
+        </w:tc>
+        <w:tc>
+          <w:tcPr/>
+          <w:p>
+            <w:pPr>
+              <w:pStyle w:val="Compact"/>
+              <w:jc w:val="left"/>
+            </w:pPr>
+            <w:r>
+              <w:t xml:space="preserve">0.958</w:t>
+            </w:r>
+          </w:p>
+        </w:tc>
+        <w:tc>
+          <w:tcPr/>
+          <w:p>
+            <w:pPr>
+              <w:pStyle w:val="Compact"/>
+              <w:jc w:val="left"/>
+            </w:pPr>
+            <w:r>
+              <w:t xml:space="preserve">0.737</w:t>
+            </w:r>
+          </w:p>
+        </w:tc>
+        <w:tc>
+          <w:tcPr/>
+          <w:p>
+            <w:pPr>
+              <w:pStyle w:val="Compact"/>
+              <w:jc w:val="left"/>
+            </w:pPr>
+            <w:r>
+              <w:t xml:space="preserve">0.024</w:t>
+            </w:r>
+          </w:p>
+        </w:tc>
+        <w:tc>
+          <w:tcPr/>
+          <w:p>
+            <w:pPr>
+              <w:pStyle w:val="Compact"/>
+              <w:jc w:val="left"/>
+            </w:pPr>
+            <w:r>
+              <w:t xml:space="preserve">0.99</w:t>
+            </w:r>
+          </w:p>
+        </w:tc>
+        <w:tc>
+          <w:tcPr/>
+          <w:p>
+            <w:pPr>
+              <w:pStyle w:val="Compact"/>
+              <w:jc w:val="left"/>
+            </w:pPr>
+            <w:r>
+              <w:t xml:space="preserve">7/10</w:t>
+            </w:r>
+          </w:p>
+        </w:tc>
+        <w:tc>
+          <w:tcPr/>
+          <w:p>
+            <w:pPr>
+              <w:pStyle w:val="Compact"/>
+              <w:jc w:val="left"/>
+            </w:pPr>
+            <w:r>
+              <w:t xml:space="preserve">0.771</w:t>
+            </w:r>
+          </w:p>
+        </w:tc>
+      </w:tr>
+      <w:tr>
+        <w:tc>
+          <w:tcPr/>
+          <w:p>
+            <w:pPr>
+              <w:pStyle w:val="Compact"/>
+              <w:jc w:val="left"/>
+            </w:pPr>
+            <w:r>
+              <w:rPr>
+                <w:bCs/>
+                <w:b/>
+              </w:rPr>
+              <w:t xml:space="preserve">v2 as promoted</w:t>
+            </w:r>
+            <w:r>
+              <w:t xml:space="preserve"> </w:t>
+            </w:r>
+            <w:r>
+              <w:t xml:space="preserve">(selected features, gradient boosting)</w:t>
+            </w:r>
+          </w:p>
+        </w:tc>
+        <w:tc>
+          <w:tcPr/>
+          <w:p>
+            <w:pPr>
+              <w:pStyle w:val="Compact"/>
+              <w:jc w:val="left"/>
+            </w:pPr>
+            <w:r>
+              <w:rPr>
+                <w:bCs/>
+                <w:b/>
+              </w:rPr>
+              <w:t xml:space="preserve">0.461</w:t>
+            </w:r>
+          </w:p>
+        </w:tc>
+        <w:tc>
+          <w:tcPr/>
+          <w:p>
+            <w:pPr>
+              <w:pStyle w:val="Compact"/>
+              <w:jc w:val="left"/>
+            </w:pPr>
+            <w:r>
+              <w:rPr>
+                <w:bCs/>
+                <w:b/>
+              </w:rPr>
+              <w:t xml:space="preserve">0.513</w:t>
+            </w:r>
+          </w:p>
+        </w:tc>
+        <w:tc>
+          <w:tcPr/>
+          <w:p>
+            <w:pPr>
+              <w:pStyle w:val="Compact"/>
+              <w:jc w:val="left"/>
+            </w:pPr>
+            <w:r>
+              <w:rPr>
+                <w:bCs/>
+                <w:b/>
+              </w:rPr>
+              <w:t xml:space="preserve">0.485</w:t>
+            </w:r>
+          </w:p>
+        </w:tc>
+        <w:tc>
+          <w:tcPr/>
+          <w:p>
+            <w:pPr>
+              <w:pStyle w:val="Compact"/>
+              <w:jc w:val="left"/>
+            </w:pPr>
+            <w:r>
+              <w:rPr>
+                <w:bCs/>
+                <w:b/>
+              </w:rPr>
+              <w:t xml:space="preserve">0.959</w:t>
+            </w:r>
+          </w:p>
+        </w:tc>
+        <w:tc>
+          <w:tcPr/>
+          <w:p>
+            <w:pPr>
+              <w:pStyle w:val="Compact"/>
+              <w:jc w:val="left"/>
+            </w:pPr>
+            <w:r>
+              <w:rPr>
+                <w:bCs/>
+                <w:b/>
+              </w:rPr>
+              <w:t xml:space="preserve">0.745</w:t>
+            </w:r>
+          </w:p>
+        </w:tc>
+        <w:tc>
+          <w:tcPr/>
+          <w:p>
+            <w:pPr>
+              <w:pStyle w:val="Compact"/>
+              <w:jc w:val="left"/>
+            </w:pPr>
+            <w:r>
+              <w:t xml:space="preserve">0.024</w:t>
+            </w:r>
+          </w:p>
+        </w:tc>
+        <w:tc>
+          <w:tcPr/>
+          <w:p>
+            <w:pPr>
+              <w:pStyle w:val="Compact"/>
+              <w:jc w:val="left"/>
+            </w:pPr>
+            <w:r>
+              <w:t xml:space="preserve">1.17</w:t>
+            </w:r>
+          </w:p>
+        </w:tc>
+        <w:tc>
+          <w:tcPr/>
+          <w:p>
+            <w:pPr>
+              <w:pStyle w:val="Compact"/>
+              <w:jc w:val="left"/>
+            </w:pPr>
+            <w:r>
+              <w:rPr>
+                <w:bCs/>
+                <w:b/>
+              </w:rPr>
+              <w:t xml:space="preserve">8/10</w:t>
+            </w:r>
+          </w:p>
+        </w:tc>
+        <w:tc>
+          <w:tcPr/>
+          <w:p>
+            <w:pPr>
+              <w:pStyle w:val="Compact"/>
+              <w:jc w:val="left"/>
+            </w:pPr>
+            <w:r>
+              <w:rPr>
+                <w:bCs/>
+                <w:b/>
+              </w:rPr>
+              <w:t xml:space="preserve">0.836</w:t>
+            </w:r>
+          </w:p>
+        </w:tc>
+      </w:tr>
+      <w:tr>
+        <w:tc>
+          <w:tcPr/>
+          <w:p>
+            <w:pPr>
+              <w:pStyle w:val="Compact"/>
+              <w:jc w:val="left"/>
+            </w:pPr>
+            <w:r>
+              <w:t xml:space="preserve">v2 with persistence (not used)</w:t>
+            </w:r>
+          </w:p>
+        </w:tc>
+        <w:tc>
+          <w:tcPr/>
+          <w:p>
+            <w:pPr>
+              <w:pStyle w:val="Compact"/>
+              <w:jc w:val="left"/>
+            </w:pPr>
+            <w:r>
+              <w:t xml:space="preserve">0.328</w:t>
+            </w:r>
+          </w:p>
+        </w:tc>
+        <w:tc>
+          <w:tcPr/>
+          <w:p>
+            <w:pPr>
+              <w:pStyle w:val="Compact"/>
+              <w:jc w:val="left"/>
+            </w:pPr>
+            <w:r>
+              <w:t xml:space="preserve">0.568</w:t>
+            </w:r>
+          </w:p>
+        </w:tc>
+        <w:tc>
+          <w:tcPr/>
+          <w:p>
+            <w:pPr>
+              <w:pStyle w:val="Compact"/>
+              <w:jc w:val="left"/>
+            </w:pPr>
+            <w:r>
+              <w:t xml:space="preserve">0.416</w:t>
+            </w:r>
+          </w:p>
+        </w:tc>
+        <w:tc>
+          <w:tcPr/>
+          <w:p>
+            <w:pPr>
+              <w:pStyle w:val="Compact"/>
+              <w:jc w:val="left"/>
+            </w:pPr>
+            <w:r>
+              <w:t xml:space="preserve">0.940</w:t>
+            </w:r>
+          </w:p>
+        </w:tc>
+        <w:tc>
+          <w:tcPr/>
+          <w:p>
+            <w:pPr>
+              <w:pStyle w:val="Compact"/>
+              <w:jc w:val="left"/>
+            </w:pPr>
+            <w:r>
+              <w:t xml:space="preserve">0.761</w:t>
+            </w:r>
+          </w:p>
+        </w:tc>
+        <w:tc>
+          <w:tcPr/>
+          <w:p>
+            <w:pPr>
+              <w:pStyle w:val="Compact"/>
+              <w:jc w:val="left"/>
+            </w:pPr>
+            <w:r>
+              <w:t xml:space="preserve">0.046</w:t>
+            </w:r>
+          </w:p>
+        </w:tc>
+        <w:tc>
+          <w:tcPr/>
+          <w:p>
+            <w:pPr>
+              <w:pStyle w:val="Compact"/>
+              <w:jc w:val="left"/>
+            </w:pPr>
+            <w:r>
+              <w:t xml:space="preserve">1.28</w:t>
+            </w:r>
+          </w:p>
+        </w:tc>
+        <w:tc>
+          <w:tcPr/>
+          <w:p>
+            <w:pPr>
+              <w:pStyle w:val="Compact"/>
+              <w:jc w:val="left"/>
+            </w:pPr>
+            <w:r>
+              <w:t xml:space="preserve">8/10</w:t>
+            </w:r>
+          </w:p>
+        </w:tc>
+        <w:tc>
+          <w:tcPr/>
+          <w:p>
+            <w:pPr>
+              <w:pStyle w:val="Compact"/>
+              <w:jc w:val="left"/>
+            </w:pPr>
+            <w:r>
+              <w:t xml:space="preserve">0.836</w:t>
+            </w:r>
+          </w:p>
+        </w:tc>
+      </w:tr>
+    </w:tbl>
+    <w:p>
+      <w:pPr>
+        <w:numPr>
+          <w:ilvl w:val="0"/>
+          <w:numId w:val="1013"/>
+        </w:numPr>
+        <w:pStyle w:val="Compact"/>
+      </w:pPr>
+      <w:r>
+        <w:rPr>
+          <w:bCs/>
+          <w:b/>
+        </w:rPr>
+        <w:t xml:space="preserve">Cross-validation on train + validation (out-of-fold, selected):</w:t>
+      </w:r>
+      <w:r>
+        <w:t xml:space="preserve"> </w:t>
+      </w:r>
+      <w:r>
+        <w:t xml:space="preserve">segment-balanced AP 0.499, AP 0.794, ROC-AUC 0.925.</w:t>
+      </w:r>
+    </w:p>
+    <w:p>
+      <w:pPr>
+        <w:numPr>
+          <w:ilvl w:val="0"/>
+          <w:numId w:val="1013"/>
+        </w:numPr>
+        <w:pStyle w:val="Compact"/>
+      </w:pPr>
+      <w:r>
+        <w:rPr>
+          <w:bCs/>
+          <w:b/>
+        </w:rPr>
+        <w:t xml:space="preserve">Where the gain comes from:</w:t>
+      </w:r>
+      <w:r>
+        <w:t xml:space="preserve"> </w:t>
+      </w:r>
+      <w:r>
+        <w:t xml:space="preserve">most of the F1 gain (0.31 to 0.47) comes from fitting on train + validation (the later calendar days resemble the test block more); the new features and the boosted classifier add a further 0.01 F1, +0.065 AUC and one more detected segment. Be precise about this in any publication.</w:t>
+      </w:r>
+    </w:p>
+    <w:p>
+      <w:pPr>
+        <w:numPr>
+          <w:ilvl w:val="0"/>
+          <w:numId w:val="1013"/>
+        </w:numPr>
+        <w:pStyle w:val="Compact"/>
+      </w:pPr>
+      <w:r>
+        <w:rPr>
+          <w:bCs/>
+          <w:b/>
+        </w:rPr>
+        <w:t xml:space="preserve">Not detected:</w:t>
+      </w:r>
+      <w:r>
+        <w:t xml:space="preserve"> </w:t>
+      </w:r>
+      <w:r>
+        <w:t xml:space="preserve">segments 29 and 33 (96 and 80 windows) are never flagged. Median detection latency 57.5 s.</w:t>
+      </w:r>
+    </w:p>
+    <w:p>
+      <w:pPr>
+        <w:numPr>
+          <w:ilvl w:val="0"/>
+          <w:numId w:val="1013"/>
+        </w:numPr>
+        <w:pStyle w:val="Compact"/>
+      </w:pPr>
+      <w:r>
+        <w:rPr>
+          <w:bCs/>
+          <w:b/>
+        </w:rPr>
+        <w:t xml:space="preserve">Plain accuracy is not the headline:</w:t>
+      </w:r>
+      <w:r>
+        <w:t xml:space="preserve"> </w:t>
+      </w:r>
+      <w:r>
+        <w:t xml:space="preserve">always-benign scores 0.962.</w:t>
+      </w:r>
+    </w:p>
+    <w:p>
+      <w:pPr>
+        <w:numPr>
+          <w:ilvl w:val="0"/>
+          <w:numId w:val="1013"/>
+        </w:numPr>
+        <w:pStyle w:val="Compact"/>
+      </w:pPr>
+      <w:r>
+        <w:rPr>
+          <w:bCs/>
+          <w:b/>
+        </w:rPr>
+        <w:t xml:space="preserve">On the healthy twin</w:t>
+      </w:r>
+      <w:r>
+        <w:t xml:space="preserve"> </w:t>
+      </w:r>
+      <w:r>
+        <w:t xml:space="preserve">(4 simulated hours, noise on; synthetic plant, not SWaT performance): 0 alarm episodes; synthetic actuator attacks flagged after 1 to 10 s (</w:t>
+      </w:r>
+      <w:r>
+        <w:rPr>
+          <w:rStyle w:val="VerbatimChar"/>
+        </w:rPr>
+        <w:t xml:space="preserve">docs/reports/twin_domain_gap_report.md</w:t>
+      </w:r>
+      <w:r>
+        <w:t xml:space="preserve"> </w:t>
+      </w:r>
+      <w:r>
+        <w:t xml:space="preserve">is v1’s; the v2 twin numbers are in the generated benchmark report).</w:t>
+      </w:r>
+    </w:p>
+    <w:bookmarkEnd w:id="75"/>
+    <w:bookmarkStart w:id="76" w:name="Xcd30e8a97f8e88412e5a486c430b11a89b3dd71"/>
     <w:p>
       <w:pPr>
         <w:pStyle w:val="Heading3"/>
@@ -14483,8 +15804,8 @@
         <w:t xml:space="preserve">(a re-sent identical payload within 2 s is caught only by the duplicate-payload check). This is the gap the advisory model is for, and the honest weak spot of the rule layers.</w:t>
       </w:r>
     </w:p>
-    <w:bookmarkEnd w:id="74"/>
-    <w:bookmarkStart w:id="75" w:name="X239872e93c2152cc0d6b2e3d8cba15aadf12ce9"/>
+    <w:bookmarkEnd w:id="76"/>
+    <w:bookmarkStart w:id="77" w:name="X239872e93c2152cc0d6b2e3d8cba15aadf12ce9"/>
     <w:p>
       <w:pPr>
         <w:pStyle w:val="Heading3"/>
@@ -14527,8 +15848,8 @@
         <w:t xml:space="preserve">These describe the demonstration plant only and say nothing about SWaT detection performance.</w:t>
       </w:r>
     </w:p>
-    <w:bookmarkEnd w:id="75"/>
-    <w:bookmarkStart w:id="76" w:name="Xe3c0fe569b12ad744e88bb4bf83054586889737"/>
+    <w:bookmarkEnd w:id="77"/>
+    <w:bookmarkStart w:id="78" w:name="Xe3c0fe569b12ad744e88bb4bf83054586889737"/>
     <w:p>
       <w:pPr>
         <w:pStyle w:val="Heading3"/>
@@ -15158,8 +16479,8 @@
         <w:t xml:space="preserve">, p95 4.76 ms, p99 13.2 ms. The hops overlap (two threads), so they do not sum to the total.</w:t>
       </w:r>
     </w:p>
-    <w:bookmarkEnd w:id="76"/>
-    <w:bookmarkStart w:id="77" w:name="X3b52ca8d77e3116d4744651de56130a73cd1445"/>
+    <w:bookmarkEnd w:id="78"/>
+    <w:bookmarkStart w:id="79" w:name="X3b52ca8d77e3116d4744651de56130a73cd1445"/>
     <w:p>
       <w:pPr>
         <w:pStyle w:val="Heading3"/>
@@ -15183,9 +16504,9 @@
         </w:pict>
       </w:r>
     </w:p>
-    <w:bookmarkEnd w:id="77"/>
-    <w:bookmarkEnd w:id="78"/>
-    <w:bookmarkStart w:id="79" w:name="verification-and-testing"/>
+    <w:bookmarkEnd w:id="79"/>
+    <w:bookmarkEnd w:id="80"/>
+    <w:bookmarkStart w:id="81" w:name="verification-and-testing"/>
     <w:p>
       <w:pPr>
         <w:pStyle w:val="Heading2"/>
@@ -15198,7 +16519,7 @@
       <w:pPr>
         <w:numPr>
           <w:ilvl w:val="0"/>
-          <w:numId w:val="1012"/>
+          <w:numId w:val="1014"/>
         </w:numPr>
         <w:pStyle w:val="Compact"/>
       </w:pPr>
@@ -15272,7 +16593,7 @@
       <w:pPr>
         <w:numPr>
           <w:ilvl w:val="0"/>
-          <w:numId w:val="1012"/>
+          <w:numId w:val="1014"/>
         </w:numPr>
         <w:pStyle w:val="Compact"/>
       </w:pPr>
@@ -15294,7 +16615,7 @@
       <w:pPr>
         <w:numPr>
           <w:ilvl w:val="0"/>
-          <w:numId w:val="1012"/>
+          <w:numId w:val="1014"/>
         </w:numPr>
         <w:pStyle w:val="Compact"/>
       </w:pPr>
@@ -15337,7 +16658,7 @@
       <w:pPr>
         <w:numPr>
           <w:ilvl w:val="0"/>
-          <w:numId w:val="1012"/>
+          <w:numId w:val="1014"/>
         </w:numPr>
         <w:pStyle w:val="Compact"/>
       </w:pPr>
@@ -15398,7 +16719,7 @@
       <w:pPr>
         <w:numPr>
           <w:ilvl w:val="0"/>
-          <w:numId w:val="1012"/>
+          <w:numId w:val="1014"/>
         </w:numPr>
         <w:pStyle w:val="Compact"/>
       </w:pPr>
@@ -15420,7 +16741,7 @@
       <w:pPr>
         <w:numPr>
           <w:ilvl w:val="0"/>
-          <w:numId w:val="1012"/>
+          <w:numId w:val="1014"/>
         </w:numPr>
         <w:pStyle w:val="Compact"/>
       </w:pPr>
@@ -15445,8 +16766,8 @@
         </w:pict>
       </w:r>
     </w:p>
-    <w:bookmarkEnd w:id="79"/>
-    <w:bookmarkStart w:id="80" w:name="limitations-and-threats-to-validity"/>
+    <w:bookmarkEnd w:id="81"/>
+    <w:bookmarkStart w:id="82" w:name="limitations-and-threats-to-validity"/>
     <w:p>
       <w:pPr>
         <w:pStyle w:val="Heading2"/>
@@ -15459,7 +16780,7 @@
       <w:pPr>
         <w:numPr>
           <w:ilvl w:val="0"/>
-          <w:numId w:val="1013"/>
+          <w:numId w:val="1015"/>
         </w:numPr>
         <w:pStyle w:val="Compact"/>
       </w:pPr>
@@ -15481,7 +16802,7 @@
       <w:pPr>
         <w:numPr>
           <w:ilvl w:val="0"/>
-          <w:numId w:val="1013"/>
+          <w:numId w:val="1015"/>
         </w:numPr>
         <w:pStyle w:val="Compact"/>
       </w:pPr>
@@ -15503,7 +16824,7 @@
       <w:pPr>
         <w:numPr>
           <w:ilvl w:val="0"/>
-          <w:numId w:val="1013"/>
+          <w:numId w:val="1015"/>
         </w:numPr>
         <w:pStyle w:val="Compact"/>
       </w:pPr>
@@ -15525,7 +16846,7 @@
       <w:pPr>
         <w:numPr>
           <w:ilvl w:val="0"/>
-          <w:numId w:val="1013"/>
+          <w:numId w:val="1015"/>
         </w:numPr>
         <w:pStyle w:val="Compact"/>
       </w:pPr>
@@ -15547,7 +16868,7 @@
       <w:pPr>
         <w:numPr>
           <w:ilvl w:val="0"/>
-          <w:numId w:val="1013"/>
+          <w:numId w:val="1015"/>
         </w:numPr>
         <w:pStyle w:val="Compact"/>
       </w:pPr>
@@ -15584,7 +16905,7 @@
       <w:pPr>
         <w:numPr>
           <w:ilvl w:val="0"/>
-          <w:numId w:val="1013"/>
+          <w:numId w:val="1015"/>
         </w:numPr>
         <w:pStyle w:val="Compact"/>
       </w:pPr>
@@ -15606,7 +16927,7 @@
       <w:pPr>
         <w:numPr>
           <w:ilvl w:val="0"/>
-          <w:numId w:val="1013"/>
+          <w:numId w:val="1015"/>
         </w:numPr>
         <w:pStyle w:val="Compact"/>
       </w:pPr>
@@ -15628,7 +16949,7 @@
       <w:pPr>
         <w:numPr>
           <w:ilvl w:val="0"/>
-          <w:numId w:val="1013"/>
+          <w:numId w:val="1015"/>
         </w:numPr>
         <w:pStyle w:val="Compact"/>
       </w:pPr>
@@ -15650,7 +16971,7 @@
       <w:pPr>
         <w:numPr>
           <w:ilvl w:val="0"/>
-          <w:numId w:val="1013"/>
+          <w:numId w:val="1015"/>
         </w:numPr>
         <w:pStyle w:val="Compact"/>
       </w:pPr>
@@ -15672,7 +16993,7 @@
       <w:pPr>
         <w:numPr>
           <w:ilvl w:val="0"/>
-          <w:numId w:val="1013"/>
+          <w:numId w:val="1015"/>
         </w:numPr>
         <w:pStyle w:val="Compact"/>
       </w:pPr>
@@ -15694,7 +17015,7 @@
       <w:pPr>
         <w:numPr>
           <w:ilvl w:val="0"/>
-          <w:numId w:val="1013"/>
+          <w:numId w:val="1015"/>
         </w:numPr>
         <w:pStyle w:val="Compact"/>
       </w:pPr>
@@ -15716,7 +17037,7 @@
       <w:pPr>
         <w:numPr>
           <w:ilvl w:val="0"/>
-          <w:numId w:val="1013"/>
+          <w:numId w:val="1015"/>
         </w:numPr>
         <w:pStyle w:val="Compact"/>
       </w:pPr>
@@ -15738,7 +17059,7 @@
       <w:pPr>
         <w:numPr>
           <w:ilvl w:val="0"/>
-          <w:numId w:val="1013"/>
+          <w:numId w:val="1015"/>
         </w:numPr>
         <w:pStyle w:val="Compact"/>
       </w:pPr>
@@ -15760,7 +17081,7 @@
       <w:pPr>
         <w:numPr>
           <w:ilvl w:val="0"/>
-          <w:numId w:val="1013"/>
+          <w:numId w:val="1015"/>
         </w:numPr>
         <w:pStyle w:val="Compact"/>
       </w:pPr>
@@ -15785,8 +17106,8 @@
         </w:pict>
       </w:r>
     </w:p>
-    <w:bookmarkEnd w:id="80"/>
-    <w:bookmarkStart w:id="81" w:name="Xd0e4e131159388e40cf3e702c6038b377be792a"/>
+    <w:bookmarkEnd w:id="82"/>
+    <w:bookmarkStart w:id="83" w:name="Xd0e4e131159388e40cf3e702c6038b377be792a"/>
     <w:p>
       <w:pPr>
         <w:pStyle w:val="Heading2"/>
@@ -16294,8 +17615,8 @@
         </w:pict>
       </w:r>
     </w:p>
-    <w:bookmarkEnd w:id="81"/>
-    <w:bookmarkStart w:id="82" w:name="glossary"/>
+    <w:bookmarkEnd w:id="83"/>
+    <w:bookmarkStart w:id="84" w:name="glossary"/>
     <w:p>
       <w:pPr>
         <w:pStyle w:val="Heading2"/>
@@ -16633,8 +17954,8 @@
         </w:pict>
       </w:r>
     </w:p>
-    <w:bookmarkEnd w:id="82"/>
-    <w:bookmarkStart w:id="83" w:name="figures-and-tables-available-for-reuse"/>
+    <w:bookmarkEnd w:id="84"/>
+    <w:bookmarkStart w:id="85" w:name="figures-and-tables-available-for-reuse"/>
     <w:p>
       <w:pPr>
         <w:pStyle w:val="Heading2"/>
@@ -16837,8 +18158,8 @@
         <w:t xml:space="preserve">), and the evidence hierarchy of section 8.</w:t>
       </w:r>
     </w:p>
-    <w:bookmarkEnd w:id="83"/>
-    <w:bookmarkStart w:id="84" w:name="X6674581391ac3336c22bf67c1b16358fa5b5fb1"/>
+    <w:bookmarkEnd w:id="85"/>
+    <w:bookmarkStart w:id="86" w:name="X6674581391ac3336c22bf67c1b16358fa5b5fb1"/>
     <w:p>
       <w:pPr>
         <w:pStyle w:val="Heading2"/>
@@ -16851,7 +18172,7 @@
       <w:pPr>
         <w:numPr>
           <w:ilvl w:val="0"/>
-          <w:numId w:val="1014"/>
+          <w:numId w:val="1016"/>
         </w:numPr>
         <w:pStyle w:val="Compact"/>
       </w:pPr>
@@ -16894,7 +18215,7 @@
       <w:pPr>
         <w:numPr>
           <w:ilvl w:val="0"/>
-          <w:numId w:val="1014"/>
+          <w:numId w:val="1016"/>
         </w:numPr>
         <w:pStyle w:val="Compact"/>
       </w:pPr>
@@ -16937,7 +18258,7 @@
       <w:pPr>
         <w:numPr>
           <w:ilvl w:val="0"/>
-          <w:numId w:val="1014"/>
+          <w:numId w:val="1016"/>
         </w:numPr>
         <w:pStyle w:val="Compact"/>
       </w:pPr>
@@ -16974,7 +18295,7 @@
       <w:pPr>
         <w:numPr>
           <w:ilvl w:val="0"/>
-          <w:numId w:val="1014"/>
+          <w:numId w:val="1016"/>
         </w:numPr>
         <w:pStyle w:val="Compact"/>
       </w:pPr>
@@ -17004,7 +18325,7 @@
       <w:pPr>
         <w:numPr>
           <w:ilvl w:val="0"/>
-          <w:numId w:val="1014"/>
+          <w:numId w:val="1016"/>
         </w:numPr>
         <w:pStyle w:val="Compact"/>
       </w:pPr>
@@ -17034,7 +18355,7 @@
       <w:pPr>
         <w:numPr>
           <w:ilvl w:val="0"/>
-          <w:numId w:val="1014"/>
+          <w:numId w:val="1016"/>
         </w:numPr>
         <w:pStyle w:val="Compact"/>
       </w:pPr>
@@ -17082,7 +18403,7 @@
       <w:pPr>
         <w:numPr>
           <w:ilvl w:val="0"/>
-          <w:numId w:val="1014"/>
+          <w:numId w:val="1016"/>
         </w:numPr>
         <w:pStyle w:val="Compact"/>
       </w:pPr>
@@ -17119,7 +18440,7 @@
       <w:pPr>
         <w:numPr>
           <w:ilvl w:val="0"/>
-          <w:numId w:val="1014"/>
+          <w:numId w:val="1016"/>
         </w:numPr>
         <w:pStyle w:val="Compact"/>
       </w:pPr>
@@ -17145,8 +18466,8 @@
         <w:t xml:space="preserve">NIST SP 800-82 (current revision).</w:t>
       </w:r>
     </w:p>
-    <w:bookmarkEnd w:id="84"/>
-    <w:bookmarkStart w:id="85" w:name="X28676b40844ce5bbd381d2b23911a140ff75051"/>
+    <w:bookmarkEnd w:id="86"/>
+    <w:bookmarkStart w:id="87" w:name="X28676b40844ce5bbd381d2b23911a140ff75051"/>
     <w:p>
       <w:pPr>
         <w:pStyle w:val="Heading2"/>
@@ -17830,8 +19151,8 @@
         </w:tc>
       </w:tr>
     </w:tbl>
-    <w:bookmarkEnd w:id="85"/>
-    <w:bookmarkEnd w:id="86"/>
+    <w:bookmarkEnd w:id="87"/>
+    <w:bookmarkEnd w:id="88"/>
     <w:sectPr/>
   </w:body>
 </w:document>
@@ -18220,6 +19541,12 @@
     <w:abstractNumId w:val="991"/>
   </w:num>
   <w:num w:numId="1013">
+    <w:abstractNumId w:val="991"/>
+  </w:num>
+  <w:num w:numId="1014">
+    <w:abstractNumId w:val="991"/>
+  </w:num>
+  <w:num w:numId="1015">
     <w:abstractNumId w:val="99411"/>
     <w:lvlOverride w:ilvl="0">
       <w:startOverride w:val="1"/>
@@ -18249,7 +19576,7 @@
       <w:startOverride w:val="1"/>
     </w:lvlOverride>
   </w:num>
-  <w:num w:numId="1014">
+  <w:num w:numId="1016">
     <w:abstractNumId w:val="99411"/>
     <w:lvlOverride w:ilvl="0">
       <w:startOverride w:val="1"/>

</xml_diff>

<commit_message>
Bring PROJECT_DETAILS up to date with v2, the latency run and the audit work
The long-form description feeds the slides and paper, and still carried the v1 model
in its abstract (30 s windows, ROC-AUC 0.82, 6/10 segments) and the old latency table.
- abstract and limitation 3: live v2 model and its measured numbers
- latency table regenerated from benchmarks/latest.json (median 0.50 ms)
- file index reflects core/, research/ and the five middleware modules
- new section: the adversarial audit, each finding with its before/after
- the 4.17 ms live round-trip figure is flagged as pre-refactor and not re-measured
.docx regenerated from the markdown.

Co-Authored-By: Claude Sonnet 5.5 <noreply@anthropic.com>
Claude-Session: https://claude.ai/code/session_01CCaa5ryDCYmdUxSsXWXtH1
</commit_message>
<xml_diff>
--- a/docs/PROJECT_DETAILS.docx
+++ b/docs/PROJECT_DETAILS.docx
@@ -2,7 +2,7 @@
 <file path=word/document.xml><?xml version="1.0" encoding="utf-8"?>
 <w:document xmlns:w="http://schemas.openxmlformats.org/wordprocessingml/2006/main" xmlns:m="http://schemas.openxmlformats.org/officeDocument/2006/math" xmlns:r="http://schemas.openxmlformats.org/officeDocument/2006/relationships" xmlns:o="urn:schemas-microsoft-com:office:office" xmlns:v="urn:schemas-microsoft-com:vml" xmlns:w10="urn:schemas-microsoft-com:office:word" xmlns:a="http://schemas.openxmlformats.org/drawingml/2006/main" xmlns:pic="http://schemas.openxmlformats.org/drawingml/2006/picture" xmlns:wp="http://schemas.openxmlformats.org/drawingml/2006/wordprocessingDrawing">
   <w:body>
-    <w:bookmarkStart w:id="88" w:name="Xe03ad410c3028613eb9ee7a520dd892489b5d33"/>
+    <w:bookmarkStart w:id="95" w:name="Xe03ad410c3028613eb9ee7a520dd892489b5d33"/>
     <w:p>
       <w:pPr>
         <w:pStyle w:val="Heading1"/>
@@ -381,7 +381,10 @@
         <w:t xml:space="preserve">advisory machine-learning model</w:t>
       </w:r>
       <w:r>
-        <w:t xml:space="preserve">: an Isolation Forest and a Random Forest regressor over 30-second telemetry windows, trained only on the SWaT water-treatment dataset. A rule-based</w:t>
+        <w:t xml:space="preserve"> </w:t>
+      </w:r>
+      <w:r>
+        <w:t xml:space="preserve">(physical model v2): a gradient-boosted classifier over 117 features of a 120-second telemetry window, trained only on the SWaT water-treatment dataset. A rule-based</w:t>
       </w:r>
       <w:r>
         <w:t xml:space="preserve"> </w:t>
@@ -413,7 +416,7 @@
         <w:t xml:space="preserve"> </w:t>
       </w:r>
       <w:r>
-        <w:t xml:space="preserve">exposes every hop’s computed values, and Wireshark captures independently confirm that blocked frames are real traffic and never reach the PLC. On the held-out SWaT test block the advisory model reaches ROC-AUC 0.82 (precision 0.37, recall 0.26, 1.79 false-alarm episodes per hour, 6 of 10 attack segments detected); the rule layers pass 4,400 of 4,400 constructed violating commands with no false positives, and catch 83.7 % of constructed attack sessions, missing mainly slow in-bounds drift. Decision latency of the full pipeline is about 0.5 ms per command in-process. Negative results (a weak SWaT-trained cyber model and a learned fusion model that lost to the physical model alone) are reported rather than hidden.</w:t>
+        <w:t xml:space="preserve">exposes every hop’s computed values, and Wireshark captures independently confirm that blocked frames are real traffic and never reach the PLC. On the held-out SWaT test block the advisory model reaches ROC-AUC 0.836 (precision 0.461, recall 0.513, F1 0.485, 1.17 false-alarm episodes per hour, 8 of 10 attack segments detected); the rule layers pass 4,400 of 4,400 constructed violating commands with no false positives, and catch 83.7 % of constructed attack sessions, missing mainly slow in-bounds drift. Decision latency of the full pipeline is 0.50 ms median (0.80 ms mean, 2.8 ms p99) per command in-process. Negative results (a weak SWaT-trained cyber model and a learned fusion model that lost to the physical model alone) are reported rather than hidden.</w:t>
       </w:r>
     </w:p>
     <w:p>
@@ -2259,7 +2262,7 @@
               <w:rPr>
                 <w:rStyle w:val="VerbatimChar"/>
               </w:rPr>
-              <w:t xml:space="preserve">docs/hmac_auth.py</w:t>
+              <w:t xml:space="preserve">core/hmac_auth.py</w:t>
             </w:r>
           </w:p>
         </w:tc>
@@ -2312,7 +2315,7 @@
               <w:rPr>
                 <w:rStyle w:val="VerbatimChar"/>
               </w:rPr>
-              <w:t xml:space="preserve">docs/interfaces.py</w:t>
+              <w:t xml:space="preserve">core/interfaces.py</w:t>
             </w:r>
             <w:r>
               <w:t xml:space="preserve">,</w:t>
@@ -2324,7 +2327,7 @@
               <w:rPr>
                 <w:rStyle w:val="VerbatimChar"/>
               </w:rPr>
-              <w:t xml:space="preserve">docs/netconfig.py</w:t>
+              <w:t xml:space="preserve">core/netconfig.py</w:t>
             </w:r>
           </w:p>
         </w:tc>
@@ -5906,7 +5909,7 @@
         <w:rPr>
           <w:rStyle w:val="VerbatimChar"/>
         </w:rPr>
-        <w:t xml:space="preserve">docs/interfaces.py</w:t>
+        <w:t xml:space="preserve">core/interfaces.py</w:t>
       </w:r>
       <w:r>
         <w:t xml:space="preserve">, so the twin sits at the measured SWaT operating point at nominal set-points. Two tests guard this:</w:t>
@@ -6241,7 +6244,7 @@
       </w:tr>
     </w:tbl>
     <w:bookmarkEnd w:id="41"/>
-    <w:bookmarkStart w:id="42" w:name="X3a93f0cb49b55b8d5852ceab3cfb2cecfb11415"/>
+    <w:bookmarkStart w:id="42" w:name="X3eab7ae66e62ffb3a96d6d1b7b89e2d3e943908"/>
     <w:p>
       <w:pPr>
         <w:pStyle w:val="Heading3"/>
@@ -6253,7 +6256,7 @@
         <w:rPr>
           <w:rStyle w:val="VerbatimChar"/>
         </w:rPr>
-        <w:t xml:space="preserve">docs/hmac_auth.py</w:t>
+        <w:t xml:space="preserve">core/hmac_auth.py</w:t>
       </w:r>
       <w:r>
         <w:t xml:space="preserve">)</w:t>
@@ -12807,7 +12810,7 @@
       </w:r>
     </w:p>
     <w:bookmarkEnd w:id="70"/>
-    <w:bookmarkStart w:id="71" w:name="attack-log-docsattack_log.py"/>
+    <w:bookmarkStart w:id="71" w:name="attack-log-coreattack_log.py"/>
     <w:p>
       <w:pPr>
         <w:pStyle w:val="Heading3"/>
@@ -12819,7 +12822,7 @@
         <w:rPr>
           <w:rStyle w:val="VerbatimChar"/>
         </w:rPr>
-        <w:t xml:space="preserve">docs/attack_log.py</w:t>
+        <w:t xml:space="preserve">core/attack_log.py</w:t>
       </w:r>
       <w:r>
         <w:t xml:space="preserve">)</w:t>
@@ -15966,43 +15969,43 @@
               <w:jc w:val="left"/>
             </w:pPr>
             <w:r>
-              <w:t xml:space="preserve">0.041</w:t>
-            </w:r>
-          </w:p>
-        </w:tc>
-        <w:tc>
-          <w:tcPr/>
-          <w:p>
-            <w:pPr>
-              <w:pStyle w:val="Compact"/>
-              <w:jc w:val="left"/>
-            </w:pPr>
-            <w:r>
-              <w:t xml:space="preserve">0.039</w:t>
-            </w:r>
-          </w:p>
-        </w:tc>
-        <w:tc>
-          <w:tcPr/>
-          <w:p>
-            <w:pPr>
-              <w:pStyle w:val="Compact"/>
-              <w:jc w:val="left"/>
-            </w:pPr>
-            <w:r>
-              <w:t xml:space="preserve">0.071</w:t>
-            </w:r>
-          </w:p>
-        </w:tc>
-        <w:tc>
-          <w:tcPr/>
-          <w:p>
-            <w:pPr>
-              <w:pStyle w:val="Compact"/>
-              <w:jc w:val="left"/>
-            </w:pPr>
-            <w:r>
-              <w:t xml:space="preserve">0.092</w:t>
+              <w:t xml:space="preserve">0.064</w:t>
+            </w:r>
+          </w:p>
+        </w:tc>
+        <w:tc>
+          <w:tcPr/>
+          <w:p>
+            <w:pPr>
+              <w:pStyle w:val="Compact"/>
+              <w:jc w:val="left"/>
+            </w:pPr>
+            <w:r>
+              <w:t xml:space="preserve">0.059</w:t>
+            </w:r>
+          </w:p>
+        </w:tc>
+        <w:tc>
+          <w:tcPr/>
+          <w:p>
+            <w:pPr>
+              <w:pStyle w:val="Compact"/>
+              <w:jc w:val="left"/>
+            </w:pPr>
+            <w:r>
+              <w:t xml:space="preserve">0.104</w:t>
+            </w:r>
+          </w:p>
+        </w:tc>
+        <w:tc>
+          <w:tcPr/>
+          <w:p>
+            <w:pPr>
+              <w:pStyle w:val="Compact"/>
+              <w:jc w:val="left"/>
+            </w:pPr>
+            <w:r>
+              <w:t xml:space="preserve">0.138</w:t>
             </w:r>
           </w:p>
         </w:tc>
@@ -16028,6 +16031,18 @@
               <w:jc w:val="left"/>
             </w:pPr>
             <w:r>
+              <w:t xml:space="preserve">0.010</w:t>
+            </w:r>
+          </w:p>
+        </w:tc>
+        <w:tc>
+          <w:tcPr/>
+          <w:p>
+            <w:pPr>
+              <w:pStyle w:val="Compact"/>
+              <w:jc w:val="left"/>
+            </w:pPr>
+            <w:r>
               <w:t xml:space="preserve">0.009</w:t>
             </w:r>
           </w:p>
@@ -16040,31 +16055,19 @@
               <w:jc w:val="left"/>
             </w:pPr>
             <w:r>
-              <w:t xml:space="preserve">0.008</w:t>
-            </w:r>
-          </w:p>
-        </w:tc>
-        <w:tc>
-          <w:tcPr/>
-          <w:p>
-            <w:pPr>
-              <w:pStyle w:val="Compact"/>
-              <w:jc w:val="left"/>
-            </w:pPr>
-            <w:r>
-              <w:t xml:space="preserve">0.014</w:t>
-            </w:r>
-          </w:p>
-        </w:tc>
-        <w:tc>
-          <w:tcPr/>
-          <w:p>
-            <w:pPr>
-              <w:pStyle w:val="Compact"/>
-              <w:jc w:val="left"/>
-            </w:pPr>
-            <w:r>
-              <w:t xml:space="preserve">0.035</w:t>
+              <w:t xml:space="preserve">0.015</w:t>
+            </w:r>
+          </w:p>
+        </w:tc>
+        <w:tc>
+          <w:tcPr/>
+          <w:p>
+            <w:pPr>
+              <w:pStyle w:val="Compact"/>
+              <w:jc w:val="left"/>
+            </w:pPr>
+            <w:r>
+              <w:t xml:space="preserve">0.041</w:t>
             </w:r>
           </w:p>
         </w:tc>
@@ -16090,43 +16093,43 @@
               <w:jc w:val="left"/>
             </w:pPr>
             <w:r>
-              <w:t xml:space="preserve">0.027</w:t>
-            </w:r>
-          </w:p>
-        </w:tc>
-        <w:tc>
-          <w:tcPr/>
-          <w:p>
-            <w:pPr>
-              <w:pStyle w:val="Compact"/>
-              <w:jc w:val="left"/>
-            </w:pPr>
-            <w:r>
-              <w:t xml:space="preserve">0.026</w:t>
-            </w:r>
-          </w:p>
-        </w:tc>
-        <w:tc>
-          <w:tcPr/>
-          <w:p>
-            <w:pPr>
-              <w:pStyle w:val="Compact"/>
-              <w:jc w:val="left"/>
-            </w:pPr>
-            <w:r>
-              <w:t xml:space="preserve">0.042</w:t>
-            </w:r>
-          </w:p>
-        </w:tc>
-        <w:tc>
-          <w:tcPr/>
-          <w:p>
-            <w:pPr>
-              <w:pStyle w:val="Compact"/>
-              <w:jc w:val="left"/>
-            </w:pPr>
-            <w:r>
-              <w:t xml:space="preserve">0.061</w:t>
+              <w:t xml:space="preserve">0.031</w:t>
+            </w:r>
+          </w:p>
+        </w:tc>
+        <w:tc>
+          <w:tcPr/>
+          <w:p>
+            <w:pPr>
+              <w:pStyle w:val="Compact"/>
+              <w:jc w:val="left"/>
+            </w:pPr>
+            <w:r>
+              <w:t xml:space="preserve">0.028</w:t>
+            </w:r>
+          </w:p>
+        </w:tc>
+        <w:tc>
+          <w:tcPr/>
+          <w:p>
+            <w:pPr>
+              <w:pStyle w:val="Compact"/>
+              <w:jc w:val="left"/>
+            </w:pPr>
+            <w:r>
+              <w:t xml:space="preserve">0.047</w:t>
+            </w:r>
+          </w:p>
+        </w:tc>
+        <w:tc>
+          <w:tcPr/>
+          <w:p>
+            <w:pPr>
+              <w:pStyle w:val="Compact"/>
+              <w:jc w:val="left"/>
+            </w:pPr>
+            <w:r>
+              <w:t xml:space="preserve">0.070</w:t>
             </w:r>
           </w:p>
         </w:tc>
@@ -16152,43 +16155,43 @@
               <w:jc w:val="left"/>
             </w:pPr>
             <w:r>
-              <w:t xml:space="preserve">0.221</w:t>
-            </w:r>
-          </w:p>
-        </w:tc>
-        <w:tc>
-          <w:tcPr/>
-          <w:p>
-            <w:pPr>
-              <w:pStyle w:val="Compact"/>
-              <w:jc w:val="left"/>
-            </w:pPr>
-            <w:r>
-              <w:t xml:space="preserve">0.006</w:t>
-            </w:r>
-          </w:p>
-        </w:tc>
-        <w:tc>
-          <w:tcPr/>
-          <w:p>
-            <w:pPr>
-              <w:pStyle w:val="Compact"/>
-              <w:jc w:val="left"/>
-            </w:pPr>
-            <w:r>
-              <w:t xml:space="preserve">0.921</w:t>
-            </w:r>
-          </w:p>
-        </w:tc>
-        <w:tc>
-          <w:tcPr/>
-          <w:p>
-            <w:pPr>
-              <w:pStyle w:val="Compact"/>
-              <w:jc w:val="left"/>
-            </w:pPr>
-            <w:r>
-              <w:t xml:space="preserve">1.106</w:t>
+              <w:t xml:space="preserve">0.330</w:t>
+            </w:r>
+          </w:p>
+        </w:tc>
+        <w:tc>
+          <w:tcPr/>
+          <w:p>
+            <w:pPr>
+              <w:pStyle w:val="Compact"/>
+              <w:jc w:val="left"/>
+            </w:pPr>
+            <w:r>
+              <w:t xml:space="preserve">0.009</w:t>
+            </w:r>
+          </w:p>
+        </w:tc>
+        <w:tc>
+          <w:tcPr/>
+          <w:p>
+            <w:pPr>
+              <w:pStyle w:val="Compact"/>
+              <w:jc w:val="left"/>
+            </w:pPr>
+            <w:r>
+              <w:t xml:space="preserve">1.377</w:t>
+            </w:r>
+          </w:p>
+        </w:tc>
+        <w:tc>
+          <w:tcPr/>
+          <w:p>
+            <w:pPr>
+              <w:pStyle w:val="Compact"/>
+              <w:jc w:val="left"/>
+            </w:pPr>
+            <w:r>
+              <w:t xml:space="preserve">2.145</w:t>
             </w:r>
           </w:p>
         </w:tc>
@@ -16214,43 +16217,43 @@
               <w:jc w:val="left"/>
             </w:pPr>
             <w:r>
-              <w:t xml:space="preserve">0.011</w:t>
-            </w:r>
-          </w:p>
-        </w:tc>
-        <w:tc>
-          <w:tcPr/>
-          <w:p>
-            <w:pPr>
-              <w:pStyle w:val="Compact"/>
-              <w:jc w:val="left"/>
-            </w:pPr>
-            <w:r>
-              <w:t xml:space="preserve">0.009</w:t>
-            </w:r>
-          </w:p>
-        </w:tc>
-        <w:tc>
-          <w:tcPr/>
-          <w:p>
-            <w:pPr>
-              <w:pStyle w:val="Compact"/>
-              <w:jc w:val="left"/>
-            </w:pPr>
-            <w:r>
-              <w:t xml:space="preserve">0.023</w:t>
-            </w:r>
-          </w:p>
-        </w:tc>
-        <w:tc>
-          <w:tcPr/>
-          <w:p>
-            <w:pPr>
-              <w:pStyle w:val="Compact"/>
-              <w:jc w:val="left"/>
-            </w:pPr>
-            <w:r>
-              <w:t xml:space="preserve">0.036</w:t>
+              <w:t xml:space="preserve">0.016</w:t>
+            </w:r>
+          </w:p>
+        </w:tc>
+        <w:tc>
+          <w:tcPr/>
+          <w:p>
+            <w:pPr>
+              <w:pStyle w:val="Compact"/>
+              <w:jc w:val="left"/>
+            </w:pPr>
+            <w:r>
+              <w:t xml:space="preserve">0.014</w:t>
+            </w:r>
+          </w:p>
+        </w:tc>
+        <w:tc>
+          <w:tcPr/>
+          <w:p>
+            <w:pPr>
+              <w:pStyle w:val="Compact"/>
+              <w:jc w:val="left"/>
+            </w:pPr>
+            <w:r>
+              <w:t xml:space="preserve">0.027</w:t>
+            </w:r>
+          </w:p>
+        </w:tc>
+        <w:tc>
+          <w:tcPr/>
+          <w:p>
+            <w:pPr>
+              <w:pStyle w:val="Compact"/>
+              <w:jc w:val="left"/>
+            </w:pPr>
+            <w:r>
+              <w:t xml:space="preserve">0.044</w:t>
             </w:r>
           </w:p>
         </w:tc>
@@ -16276,43 +16279,43 @@
               <w:jc w:val="left"/>
             </w:pPr>
             <w:r>
-              <w:t xml:space="preserve">0.044</w:t>
-            </w:r>
-          </w:p>
-        </w:tc>
-        <w:tc>
-          <w:tcPr/>
-          <w:p>
-            <w:pPr>
-              <w:pStyle w:val="Compact"/>
-              <w:jc w:val="left"/>
-            </w:pPr>
-            <w:r>
-              <w:t xml:space="preserve">0.038</w:t>
-            </w:r>
-          </w:p>
-        </w:tc>
-        <w:tc>
-          <w:tcPr/>
-          <w:p>
-            <w:pPr>
-              <w:pStyle w:val="Compact"/>
-              <w:jc w:val="left"/>
-            </w:pPr>
-            <w:r>
-              <w:t xml:space="preserve">0.075</w:t>
-            </w:r>
-          </w:p>
-        </w:tc>
-        <w:tc>
-          <w:tcPr/>
-          <w:p>
-            <w:pPr>
-              <w:pStyle w:val="Compact"/>
-              <w:jc w:val="left"/>
-            </w:pPr>
-            <w:r>
-              <w:t xml:space="preserve">0.108</w:t>
+              <w:t xml:space="preserve">0.071</w:t>
+            </w:r>
+          </w:p>
+        </w:tc>
+        <w:tc>
+          <w:tcPr/>
+          <w:p>
+            <w:pPr>
+              <w:pStyle w:val="Compact"/>
+              <w:jc w:val="left"/>
+            </w:pPr>
+            <w:r>
+              <w:t xml:space="preserve">0.067</w:t>
+            </w:r>
+          </w:p>
+        </w:tc>
+        <w:tc>
+          <w:tcPr/>
+          <w:p>
+            <w:pPr>
+              <w:pStyle w:val="Compact"/>
+              <w:jc w:val="left"/>
+            </w:pPr>
+            <w:r>
+              <w:t xml:space="preserve">0.111</w:t>
+            </w:r>
+          </w:p>
+        </w:tc>
+        <w:tc>
+          <w:tcPr/>
+          <w:p>
+            <w:pPr>
+              <w:pStyle w:val="Compact"/>
+              <w:jc w:val="left"/>
+            </w:pPr>
+            <w:r>
+              <w:t xml:space="preserve">0.139</w:t>
             </w:r>
           </w:p>
         </w:tc>
@@ -16338,43 +16341,43 @@
               <w:jc w:val="left"/>
             </w:pPr>
             <w:r>
-              <w:t xml:space="preserve">0.446</w:t>
-            </w:r>
-          </w:p>
-        </w:tc>
-        <w:tc>
-          <w:tcPr/>
-          <w:p>
-            <w:pPr>
-              <w:pStyle w:val="Compact"/>
-              <w:jc w:val="left"/>
-            </w:pPr>
-            <w:r>
-              <w:t xml:space="preserve">n/a</w:t>
-            </w:r>
-          </w:p>
-        </w:tc>
-        <w:tc>
-          <w:tcPr/>
-          <w:p>
-            <w:pPr>
-              <w:pStyle w:val="Compact"/>
-              <w:jc w:val="left"/>
-            </w:pPr>
-            <w:r>
-              <w:t xml:space="preserve">1.175</w:t>
-            </w:r>
-          </w:p>
-        </w:tc>
-        <w:tc>
-          <w:tcPr/>
-          <w:p>
-            <w:pPr>
-              <w:pStyle w:val="Compact"/>
-              <w:jc w:val="left"/>
-            </w:pPr>
-            <w:r>
-              <w:t xml:space="preserve">1.380</w:t>
+              <w:t xml:space="preserve">0.640</w:t>
+            </w:r>
+          </w:p>
+        </w:tc>
+        <w:tc>
+          <w:tcPr/>
+          <w:p>
+            <w:pPr>
+              <w:pStyle w:val="Compact"/>
+              <w:jc w:val="left"/>
+            </w:pPr>
+            <w:r>
+              <w:t xml:space="preserve">0.342</w:t>
+            </w:r>
+          </w:p>
+        </w:tc>
+        <w:tc>
+          <w:tcPr/>
+          <w:p>
+            <w:pPr>
+              <w:pStyle w:val="Compact"/>
+              <w:jc w:val="left"/>
+            </w:pPr>
+            <w:r>
+              <w:t xml:space="preserve">1.724</w:t>
+            </w:r>
+          </w:p>
+        </w:tc>
+        <w:tc>
+          <w:tcPr/>
+          <w:p>
+            <w:pPr>
+              <w:pStyle w:val="Compact"/>
+              <w:jc w:val="left"/>
+            </w:pPr>
+            <w:r>
+              <w:t xml:space="preserve">2.569</w:t>
             </w:r>
           </w:p>
         </w:tc>
@@ -16408,19 +16411,19 @@
                 <w:bCs/>
                 <w:b/>
               </w:rPr>
-              <w:t xml:space="preserve">0.518</w:t>
-            </w:r>
-          </w:p>
-        </w:tc>
-        <w:tc>
-          <w:tcPr/>
-          <w:p>
-            <w:pPr>
-              <w:pStyle w:val="Compact"/>
-              <w:jc w:val="left"/>
-            </w:pPr>
-            <w:r>
-              <w:t xml:space="preserve">n/a</w:t>
+              <w:t xml:space="preserve">0.801</w:t>
+            </w:r>
+          </w:p>
+        </w:tc>
+        <w:tc>
+          <w:tcPr/>
+          <w:p>
+            <w:pPr>
+              <w:pStyle w:val="Compact"/>
+              <w:jc w:val="left"/>
+            </w:pPr>
+            <w:r>
+              <w:t xml:space="preserve">0.501</w:t>
             </w:r>
           </w:p>
         </w:tc>
@@ -16436,7 +16439,7 @@
                 <w:bCs/>
                 <w:b/>
               </w:rPr>
-              <w:t xml:space="preserve">1.266</w:t>
+              <w:t xml:space="preserve">1.972</w:t>
             </w:r>
           </w:p>
         </w:tc>
@@ -16452,7 +16455,7 @@
                 <w:bCs/>
                 <w:b/>
               </w:rPr>
-              <w:t xml:space="preserve">1.488</w:t>
+              <w:t xml:space="preserve">2.797</w:t>
             </w:r>
           </w:p>
         </w:tc>
@@ -16476,7 +16479,23 @@
         <w:t xml:space="preserve">4.17 ms</w:t>
       </w:r>
       <w:r>
-        <w:t xml:space="preserve">, p95 4.76 ms, p99 13.2 ms. The hops overlap (two threads), so they do not sum to the total.</w:t>
+        <w:t xml:space="preserve">, p95 4.76 ms, p99 13.2 ms.</w:t>
+      </w:r>
+      <w:r>
+        <w:t xml:space="preserve"> </w:t>
+      </w:r>
+      <w:r>
+        <w:rPr>
+          <w:iCs/>
+          <w:i/>
+        </w:rPr>
+        <w:t xml:space="preserve">This figure was measured before the middleware split and the move of the decision onto a worker thread (audit A2); it has not been re-measured since, so quote it as a pre-refactor number.</w:t>
+      </w:r>
+      <w:r>
+        <w:t xml:space="preserve"> </w:t>
+      </w:r>
+      <w:r>
+        <w:t xml:space="preserve">The hops overlap (two threads), so they do not sum to the total.</w:t>
       </w:r>
     </w:p>
     <w:bookmarkEnd w:id="78"/>
@@ -16839,7 +16858,7 @@
         <w:t xml:space="preserve"> </w:t>
       </w:r>
       <w:r>
-        <w:t xml:space="preserve">(recall 0.26, precision 0.37, 1.79 false-alarm episodes per hour versus a 0.5 target) because of calendar drift; it is advisory by design.</w:t>
+        <w:t xml:space="preserve">(recall 0.513, precision 0.461, 1.17 false-alarm episodes per hour versus a 0.5 target, 8 of 10 segments; the v1 model it replaced was 0.26 / 0.37 / 1.79 / 6 of 10) because of calendar drift; it is advisory by design.</w:t>
       </w:r>
     </w:p>
     <w:p>
@@ -18540,7 +18559,7 @@
               <w:rPr>
                 <w:rStyle w:val="VerbatimChar"/>
               </w:rPr>
-              <w:t xml:space="preserve">docs/interfaces.py</w:t>
+              <w:t xml:space="preserve">core/interfaces.py</w:t>
             </w:r>
             <w:r>
               <w:t xml:space="preserve">,</w:t>
@@ -18566,7 +18585,7 @@
               <w:jc w:val="left"/>
             </w:pPr>
             <w:r>
-              <w:t xml:space="preserve">Addresses and environment variables</w:t>
+              <w:t xml:space="preserve">Forensic record (append-only JSONL, replayed at dashboard start)</w:t>
             </w:r>
           </w:p>
         </w:tc>
@@ -18581,7 +18600,7 @@
               <w:rPr>
                 <w:rStyle w:val="VerbatimChar"/>
               </w:rPr>
-              <w:t xml:space="preserve">docs/netconfig.py</w:t>
+              <w:t xml:space="preserve">core/forensics.py</w:t>
             </w:r>
           </w:p>
         </w:tc>
@@ -18595,7 +18614,7 @@
               <w:jc w:val="left"/>
             </w:pPr>
             <w:r>
-              <w:t xml:space="preserve">HMAC frame and verification</w:t>
+              <w:t xml:space="preserve">Addresses and environment variables</w:t>
             </w:r>
           </w:p>
         </w:tc>
@@ -18610,7 +18629,36 @@
               <w:rPr>
                 <w:rStyle w:val="VerbatimChar"/>
               </w:rPr>
-              <w:t xml:space="preserve">docs/hmac_auth.py</w:t>
+              <w:t xml:space="preserve">core/netconfig.py</w:t>
+            </w:r>
+          </w:p>
+        </w:tc>
+      </w:tr>
+      <w:tr>
+        <w:tc>
+          <w:tcPr/>
+          <w:p>
+            <w:pPr>
+              <w:pStyle w:val="Compact"/>
+              <w:jc w:val="left"/>
+            </w:pPr>
+            <w:r>
+              <w:t xml:space="preserve">HMAC frame and verification</w:t>
+            </w:r>
+          </w:p>
+        </w:tc>
+        <w:tc>
+          <w:tcPr/>
+          <w:p>
+            <w:pPr>
+              <w:pStyle w:val="Compact"/>
+              <w:jc w:val="left"/>
+            </w:pPr>
+            <w:r>
+              <w:rPr>
+                <w:rStyle w:val="VerbatimChar"/>
+              </w:rPr>
+              <w:t xml:space="preserve">core/hmac_auth.py</w:t>
             </w:r>
           </w:p>
         </w:tc>
@@ -18740,7 +18788,7 @@
               <w:jc w:val="left"/>
             </w:pPr>
             <w:r>
-              <w:t xml:space="preserve">Server, polling, state</w:t>
+              <w:t xml:space="preserve">Transport and entry point</w:t>
             </w:r>
           </w:p>
         </w:tc>
@@ -18769,6 +18817,122 @@
               <w:jc w:val="left"/>
             </w:pPr>
             <w:r>
+              <w:t xml:space="preserve">Decision path (queue, worker, routing a write)</w:t>
+            </w:r>
+          </w:p>
+        </w:tc>
+        <w:tc>
+          <w:tcPr/>
+          <w:p>
+            <w:pPr>
+              <w:pStyle w:val="Compact"/>
+              <w:jc w:val="left"/>
+            </w:pPr>
+            <w:r>
+              <w:rPr>
+                <w:rStyle w:val="VerbatimChar"/>
+              </w:rPr>
+              <w:t xml:space="preserve">middleware/ingest.py</w:t>
+            </w:r>
+          </w:p>
+        </w:tc>
+      </w:tr>
+      <w:tr>
+        <w:tc>
+          <w:tcPr/>
+          <w:p>
+            <w:pPr>
+              <w:pStyle w:val="Compact"/>
+              <w:jc w:val="left"/>
+            </w:pPr>
+            <w:r>
+              <w:t xml:space="preserve">PLC write path (client, forward queue, worker)</w:t>
+            </w:r>
+          </w:p>
+        </w:tc>
+        <w:tc>
+          <w:tcPr/>
+          <w:p>
+            <w:pPr>
+              <w:pStyle w:val="Compact"/>
+              <w:jc w:val="left"/>
+            </w:pPr>
+            <w:r>
+              <w:rPr>
+                <w:rStyle w:val="VerbatimChar"/>
+              </w:rPr>
+              <w:t xml:space="preserve">middleware/forwarding.py</w:t>
+            </w:r>
+          </w:p>
+        </w:tc>
+      </w:tr>
+      <w:tr>
+        <w:tc>
+          <w:tcPr/>
+          <w:p>
+            <w:pPr>
+              <w:pStyle w:val="Compact"/>
+              <w:jc w:val="left"/>
+            </w:pPr>
+            <w:r>
+              <w:t xml:space="preserve">PLC read path (poll loop, telemetry, settling)</w:t>
+            </w:r>
+          </w:p>
+        </w:tc>
+        <w:tc>
+          <w:tcPr/>
+          <w:p>
+            <w:pPr>
+              <w:pStyle w:val="Compact"/>
+              <w:jc w:val="left"/>
+            </w:pPr>
+            <w:r>
+              <w:rPr>
+                <w:rStyle w:val="VerbatimChar"/>
+              </w:rPr>
+              <w:t xml:space="preserve">middleware/polling.py</w:t>
+            </w:r>
+          </w:p>
+        </w:tc>
+      </w:tr>
+      <w:tr>
+        <w:tc>
+          <w:tcPr/>
+          <w:p>
+            <w:pPr>
+              <w:pStyle w:val="Compact"/>
+              <w:jc w:val="left"/>
+            </w:pPr>
+            <w:r>
+              <w:t xml:space="preserve">Config, shared state, health</w:t>
+            </w:r>
+          </w:p>
+        </w:tc>
+        <w:tc>
+          <w:tcPr/>
+          <w:p>
+            <w:pPr>
+              <w:pStyle w:val="Compact"/>
+              <w:jc w:val="left"/>
+            </w:pPr>
+            <w:r>
+              <w:rPr>
+                <w:rStyle w:val="VerbatimChar"/>
+              </w:rPr>
+              <w:t xml:space="preserve">middleware/runtime.py</w:t>
+            </w:r>
+          </w:p>
+        </w:tc>
+      </w:tr>
+      <w:tr>
+        <w:tc>
+          <w:tcPr/>
+          <w:p>
+            <w:pPr>
+              <w:pStyle w:val="Compact"/>
+              <w:jc w:val="left"/>
+            </w:pPr>
+            <w:r>
               <w:t xml:space="preserve">Tracer</w:t>
             </w:r>
           </w:p>
@@ -18927,10 +19091,7 @@
               <w:t xml:space="preserve">models/train_physical_swat.py</w:t>
             </w:r>
             <w:r>
-              <w:t xml:space="preserve"> </w:t>
-            </w:r>
-            <w:r>
-              <w:t xml:space="preserve">(also</w:t>
+              <w:t xml:space="preserve">,</w:t>
             </w:r>
             <w:r>
               <w:t xml:space="preserve"> </w:t>
@@ -18939,10 +19100,10 @@
               <w:rPr>
                 <w:rStyle w:val="VerbatimChar"/>
               </w:rPr>
-              <w:t xml:space="preserve">train_cyber_swat.py</w:t>
-            </w:r>
-            <w:r>
-              <w:t xml:space="preserve">,</w:t>
+              <w:t xml:space="preserve">models/train_physical_v2.py</w:t>
+            </w:r>
+            <w:r>
+              <w:t xml:space="preserve">; negative results (v3, learned fusion, cyber ML) live in</w:t>
             </w:r>
             <w:r>
               <w:t xml:space="preserve"> </w:t>
@@ -18951,13 +19112,7 @@
               <w:rPr>
                 <w:rStyle w:val="VerbatimChar"/>
               </w:rPr>
-              <w:t xml:space="preserve">train_fusion_swat.py</w:t>
-            </w:r>
-            <w:r>
-              <w:t xml:space="preserve"> </w:t>
-            </w:r>
-            <w:r>
-              <w:t xml:space="preserve">for the negative results)</w:t>
+              <w:t xml:space="preserve">research/</w:t>
             </w:r>
           </w:p>
         </w:tc>
@@ -19152,7 +19307,1932 @@
       </w:tr>
     </w:tbl>
     <w:bookmarkEnd w:id="87"/>
+    <w:bookmarkStart w:id="88" w:name="Xdd32927177db3e26389adf66c8fa6191bfdddad"/>
+    <w:p>
+      <w:pPr>
+        <w:pStyle w:val="Heading2"/>
+      </w:pPr>
+      <w:r>
+        <w:t xml:space="preserve">Physical model v3 (candidate; real-data results pending)</w:t>
+      </w:r>
+    </w:p>
+    <w:p>
+      <w:pPr>
+        <w:pStyle w:val="FirstParagraph"/>
+      </w:pPr>
+      <w:r>
+        <w:t xml:space="preserve">Files:</w:t>
+      </w:r>
+      <w:r>
+        <w:t xml:space="preserve"> </w:t>
+      </w:r>
+      <w:r>
+        <w:rPr>
+          <w:rStyle w:val="VerbatimChar"/>
+        </w:rPr>
+        <w:t xml:space="preserve">research/features_v3.py</w:t>
+      </w:r>
+      <w:r>
+        <w:t xml:space="preserve">,</w:t>
+      </w:r>
+      <w:r>
+        <w:t xml:space="preserve"> </w:t>
+      </w:r>
+      <w:r>
+        <w:rPr>
+          <w:rStyle w:val="VerbatimChar"/>
+        </w:rPr>
+        <w:t xml:space="preserve">research/train_physical_v3.py</w:t>
+      </w:r>
+      <w:r>
+        <w:t xml:space="preserve">,</w:t>
+      </w:r>
+      <w:r>
+        <w:t xml:space="preserve"> </w:t>
+      </w:r>
+      <w:r>
+        <w:rPr>
+          <w:rStyle w:val="VerbatimChar"/>
+        </w:rPr>
+        <w:t xml:space="preserve">research/physical_model_v3.py</w:t>
+      </w:r>
+      <w:r>
+        <w:t xml:space="preserve">,</w:t>
+      </w:r>
+      <w:r>
+        <w:t xml:space="preserve"> </w:t>
+      </w:r>
+      <w:r>
+        <w:rPr>
+          <w:rStyle w:val="VerbatimChar"/>
+        </w:rPr>
+        <w:t xml:space="preserve">research/package_physical_v3.py</w:t>
+      </w:r>
+      <w:r>
+        <w:t xml:space="preserve">.</w:t>
+      </w:r>
+      <w:r>
+        <w:t xml:space="preserve"> </w:t>
+      </w:r>
+      <w:r>
+        <w:t xml:space="preserve">Design: 120 s windows with 30/60/120 s dynamics and time-since-last-toggle (no absolute levels); normal-only ridge consistency</w:t>
+      </w:r>
+      <w:r>
+        <w:t xml:space="preserve"> </w:t>
+      </w:r>
+      <w:r>
+        <w:t xml:space="preserve">residuals and PCA (T2/SPE, total and per stage) fitted on normal rows and cross-fitted by hour-fold to avoid in-sample optimism;</w:t>
+      </w:r>
+      <w:r>
+        <w:t xml:space="preserve"> </w:t>
+      </w:r>
+      <w:r>
+        <w:t xml:space="preserve">per-stage and global gradient-boosted heads combined by a logistic stacker; segment-grouped CV with segment-balanced AP for</w:t>
+      </w:r>
+      <w:r>
+        <w:t xml:space="preserve"> </w:t>
+      </w:r>
+      <w:r>
+        <w:t xml:space="preserve">selection; thresholds from a false-alarm budget on out-of-fold scores; the test block is used for exactly two fits (v2-recipe</w:t>
+      </w:r>
+      <w:r>
+        <w:t xml:space="preserve"> </w:t>
+      </w:r>
+      <w:r>
+        <w:t xml:space="preserve">refit baseline and the selected v3); window and event metrics, bootstrap 95% CIs, confusion/PR/segment figures.</w:t>
+      </w:r>
+      <w:r>
+        <w:t xml:space="preserve"> </w:t>
+      </w:r>
+      <w:r>
+        <w:t xml:space="preserve">Status: verified on the synthetic fixture only (code paths); NO real-data accuracy is claimed. v2 remains the live default</w:t>
+      </w:r>
+      <w:r>
+        <w:t xml:space="preserve"> </w:t>
+      </w:r>
+      <w:r>
+        <w:t xml:space="preserve">(</w:t>
+      </w:r>
+      <w:r>
+        <w:rPr>
+          <w:rStyle w:val="VerbatimChar"/>
+        </w:rPr>
+        <w:t xml:space="preserve">IM_PHYSICAL_MODEL=v3</w:t>
+      </w:r>
+      <w:r>
+        <w:t xml:space="preserve"> </w:t>
+      </w:r>
+      <w:r>
+        <w:t xml:space="preserve">opts in once packaged). Update this section with the numbers from</w:t>
+      </w:r>
+      <w:r>
+        <w:t xml:space="preserve"> </w:t>
+      </w:r>
+      <w:r>
+        <w:rPr>
+          <w:rStyle w:val="VerbatimChar"/>
+        </w:rPr>
+        <w:t xml:space="preserve">physical_v3_report.md</w:t>
+      </w:r>
+      <w:r>
+        <w:t xml:space="preserve"> </w:t>
+      </w:r>
+      <w:r>
+        <w:t xml:space="preserve">after the run.</w:t>
+      </w:r>
+    </w:p>
     <w:bookmarkEnd w:id="88"/>
+    <w:bookmarkStart w:id="89" w:name="X94f694037610cbd6dfc637b1ac7de9c7dfd7602"/>
+    <w:p>
+      <w:pPr>
+        <w:pStyle w:val="Heading2"/>
+      </w:pPr>
+      <w:r>
+        <w:t xml:space="preserve">Response layer (rule-based): authorization policy, quarantine, incident correlation</w:t>
+      </w:r>
+    </w:p>
+    <w:p>
+      <w:pPr>
+        <w:numPr>
+          <w:ilvl w:val="0"/>
+          <w:numId w:val="1017"/>
+        </w:numPr>
+        <w:pStyle w:val="Compact"/>
+      </w:pPr>
+      <w:r>
+        <w:rPr>
+          <w:rStyle w:val="VerbatimChar"/>
+        </w:rPr>
+        <w:t xml:space="preserve">middleware/policy.py</w:t>
+      </w:r>
+      <w:r>
+        <w:t xml:space="preserve">: JSON policy (</w:t>
+      </w:r>
+      <w:r>
+        <w:rPr>
+          <w:rStyle w:val="VerbatimChar"/>
+        </w:rPr>
+        <w:t xml:space="preserve">IM_POLICY_FILE</w:t>
+      </w:r>
+      <w:r>
+        <w:t xml:space="preserve">, default</w:t>
+      </w:r>
+      <w:r>
+        <w:t xml:space="preserve"> </w:t>
+      </w:r>
+      <w:r>
+        <w:rPr>
+          <w:rStyle w:val="VerbatimChar"/>
+        </w:rPr>
+        <w:t xml:space="preserve">config/policy.json</w:t>
+      </w:r>
+      <w:r>
+        <w:t xml:space="preserve">): source address -&gt; role -&gt; writable registers and</w:t>
+      </w:r>
+      <w:r>
+        <w:t xml:space="preserve"> </w:t>
+      </w:r>
+      <w:r>
+        <w:t xml:space="preserve">optional [min, max] limits;</w:t>
+      </w:r>
+      <w:r>
+        <w:t xml:space="preserve"> </w:t>
+      </w:r>
+      <w:r>
+        <w:rPr>
+          <w:rStyle w:val="VerbatimChar"/>
+        </w:rPr>
+        <w:t xml:space="preserve">default_role</w:t>
+      </w:r>
+      <w:r>
+        <w:t xml:space="preserve"> </w:t>
+      </w:r>
+      <w:r>
+        <w:t xml:space="preserve">allow/deny/role. Evaluated after HMAC, nonce and replay succeed (identity first, then</w:t>
+      </w:r>
+      <w:r>
+        <w:t xml:space="preserve"> </w:t>
+      </w:r>
+      <w:r>
+        <w:t xml:space="preserve">permission). Reasons: UNAUTHORIZED_REGISTER / UNAUTHORIZED_VALUE / UNAUTHORIZED_SOURCE. Malformed file -&gt; POLICY_ERROR on writes (fail closed);</w:t>
+      </w:r>
+      <w:r>
+        <w:t xml:space="preserve"> </w:t>
+      </w:r>
+      <w:r>
+        <w:t xml:space="preserve">reads are never restricted; hot reload every</w:t>
+      </w:r>
+      <w:r>
+        <w:t xml:space="preserve"> </w:t>
+      </w:r>
+      <w:r>
+        <w:rPr>
+          <w:rStyle w:val="VerbatimChar"/>
+        </w:rPr>
+        <w:t xml:space="preserve">IM_POLICY_RELOAD_S</w:t>
+      </w:r>
+      <w:r>
+        <w:t xml:space="preserve"> </w:t>
+      </w:r>
+      <w:r>
+        <w:t xml:space="preserve">(2 s).</w:t>
+      </w:r>
+    </w:p>
+    <w:p>
+      <w:pPr>
+        <w:numPr>
+          <w:ilvl w:val="0"/>
+          <w:numId w:val="1017"/>
+        </w:numPr>
+        <w:pStyle w:val="Compact"/>
+      </w:pPr>
+      <w:r>
+        <w:rPr>
+          <w:rStyle w:val="VerbatimChar"/>
+        </w:rPr>
+        <w:t xml:space="preserve">middleware/quarantine.py</w:t>
+      </w:r>
+      <w:r>
+        <w:t xml:space="preserve"> </w:t>
+      </w:r>
+      <w:r>
+        <w:t xml:space="preserve">(opt-in</w:t>
+      </w:r>
+      <w:r>
+        <w:t xml:space="preserve"> </w:t>
+      </w:r>
+      <w:r>
+        <w:rPr>
+          <w:rStyle w:val="VerbatimChar"/>
+        </w:rPr>
+        <w:t xml:space="preserve">IM_QUARANTINE=1|auto|force</w:t>
+      </w:r>
+      <w:r>
+        <w:t xml:space="preserve">;</w:t>
+      </w:r>
+      <w:r>
+        <w:t xml:space="preserve"> </w:t>
+      </w:r>
+      <w:r>
+        <w:rPr>
+          <w:rStyle w:val="VerbatimChar"/>
+        </w:rPr>
+        <w:t xml:space="preserve">auto</w:t>
+      </w:r>
+      <w:r>
+        <w:t xml:space="preserve">/</w:t>
+      </w:r>
+      <w:r>
+        <w:rPr>
+          <w:rStyle w:val="VerbatimChar"/>
+        </w:rPr>
+        <w:t xml:space="preserve">1</w:t>
+      </w:r>
+      <w:r>
+        <w:t xml:space="preserve"> </w:t>
+      </w:r>
+      <w:r>
+        <w:t xml:space="preserve">switch themselves OFF when every trusted source is loopback, i.e. a one-laptop demo,</w:t>
+      </w:r>
+      <w:r>
+        <w:t xml:space="preserve"> </w:t>
+      </w:r>
+      <w:r>
+        <w:rPr>
+          <w:rStyle w:val="VerbatimChar"/>
+        </w:rPr>
+        <w:t xml:space="preserve">force</w:t>
+      </w:r>
+      <w:r>
+        <w:t xml:space="preserve"> </w:t>
+      </w:r>
+      <w:r>
+        <w:t xml:space="preserve">overrides; the launcher sets</w:t>
+      </w:r>
+      <w:r>
+        <w:t xml:space="preserve"> </w:t>
+      </w:r>
+      <w:r>
+        <w:rPr>
+          <w:rStyle w:val="VerbatimChar"/>
+        </w:rPr>
+        <w:t xml:space="preserve">auto</w:t>
+      </w:r>
+      <w:r>
+        <w:t xml:space="preserve">): each blocked command adds severity-weighted strikes (forged tag 6, unsigned 4,</w:t>
+      </w:r>
+      <w:r>
+        <w:t xml:space="preserve"> </w:t>
+      </w:r>
+      <w:r>
+        <w:t xml:space="preserve">replay 4, unauthorised 6, bounds 2, cross-register 3, flood 1); limit 12 within 30 s -&gt; quarantine 60 s, doubling per repeat up to 600 s,</w:t>
+      </w:r>
+      <w:r>
+        <w:t xml:space="preserve"> </w:t>
+      </w:r>
+      <w:r>
+        <w:t xml:space="preserve">automatic release; quarantine-refused commands add no strikes; checked right after the whitelist (before any crypto).</w:t>
+      </w:r>
+    </w:p>
+    <w:p>
+      <w:pPr>
+        <w:numPr>
+          <w:ilvl w:val="0"/>
+          <w:numId w:val="1017"/>
+        </w:numPr>
+        <w:pStyle w:val="Compact"/>
+      </w:pPr>
+      <w:r>
+        <w:rPr>
+          <w:rStyle w:val="VerbatimChar"/>
+        </w:rPr>
+        <w:t xml:space="preserve">middleware/incidents.py</w:t>
+      </w:r>
+      <w:r>
+        <w:t xml:space="preserve">: non-PASS decisions grouped per source (gap 30 s) with attack types, registers, counts, timeline (40 events kept,</w:t>
+      </w:r>
+      <w:r>
+        <w:t xml:space="preserve"> </w:t>
+      </w:r>
+      <w:r>
+        <w:t xml:space="preserve">exact count), severity low/medium/high/critical (critical = quarantined or 3+ distinct types), forwarded to the dashboard panel.</w:t>
+      </w:r>
+    </w:p>
+    <w:p>
+      <w:pPr>
+        <w:numPr>
+          <w:ilvl w:val="0"/>
+          <w:numId w:val="1017"/>
+        </w:numPr>
+        <w:pStyle w:val="Compact"/>
+      </w:pPr>
+      <w:r>
+        <w:t xml:space="preserve">Evidence:</w:t>
+      </w:r>
+      <w:r>
+        <w:t xml:space="preserve"> </w:t>
+      </w:r>
+      <w:r>
+        <w:rPr>
+          <w:rStyle w:val="VerbatimChar"/>
+        </w:rPr>
+        <w:t xml:space="preserve">tests/test_response_layer.py</w:t>
+      </w:r>
+      <w:r>
+        <w:t xml:space="preserve">; live check on the real stack: two forged-HMAC frames -&gt; critical incident, source quarantined.</w:t>
+      </w:r>
+    </w:p>
+    <w:bookmarkEnd w:id="89"/>
+    <w:bookmarkStart w:id="90" w:name="evidence-pack-benchmarkevidence_pack.py"/>
+    <w:p>
+      <w:pPr>
+        <w:pStyle w:val="Heading2"/>
+      </w:pPr>
+      <w:r>
+        <w:t xml:space="preserve">Evidence pack (</w:t>
+      </w:r>
+      <w:r>
+        <w:rPr>
+          <w:rStyle w:val="VerbatimChar"/>
+        </w:rPr>
+        <w:t xml:space="preserve">benchmark/evidence_pack.py</w:t>
+      </w:r>
+      <w:r>
+        <w:t xml:space="preserve">)</w:t>
+      </w:r>
+    </w:p>
+    <w:p>
+      <w:pPr>
+        <w:pStyle w:val="FirstParagraph"/>
+      </w:pPr>
+      <w:r>
+        <w:t xml:space="preserve">One command produces the panel proof set: (1) a LIVE campaign (real PLC twin, middleware, dashboard on free loopback ports; labelled legitimate</w:t>
+      </w:r>
+      <w:r>
+        <w:t xml:space="preserve"> </w:t>
+      </w:r>
+      <w:r>
+        <w:t xml:space="preserve">traffic = 40 in-bounds signed writes, then each scripted attack; outcomes read from the dashboard’s</w:t>
+      </w:r>
+      <w:r>
+        <w:t xml:space="preserve"> </w:t>
+      </w:r>
+      <w:r>
+        <w:rPr>
+          <w:rStyle w:val="VerbatimChar"/>
+        </w:rPr>
+        <w:t xml:space="preserve">/api/flow</w:t>
+      </w:r>
+      <w:r>
+        <w:t xml:space="preserve"> </w:t>
+      </w:r>
+      <w:r>
+        <w:t xml:space="preserve">traces and the blocked-attack log);</w:t>
+      </w:r>
+      <w:r>
+        <w:t xml:space="preserve"> </w:t>
+      </w:r>
+      <w:r>
+        <w:t xml:space="preserve">(2) a deterministic response-layer demonstration (quarantine after 2 forged commands, policy cases); (3) recorded results (held-out REAL SWaT,</w:t>
+      </w:r>
+      <w:r>
+        <w:t xml:space="preserve"> </w:t>
+      </w:r>
+      <w:r>
+        <w:t xml:space="preserve">rule regression on constructed scenarios). Commands are labelled by the phase that sent them, so multi-step attacks whose early steps are</w:t>
+      </w:r>
+      <w:r>
+        <w:t xml:space="preserve"> </w:t>
+      </w:r>
+      <w:r>
+        <w:t xml:space="preserve">allowed by design (flood’s first 5 frames, the original frame of a replay, the early ramp steps of cross-register) count as command-level misses;</w:t>
+      </w:r>
+      <w:r>
+        <w:t xml:space="preserve"> </w:t>
+      </w:r>
+      <w:r>
+        <w:t xml:space="preserve">a note column explains each. First run: command-level TN 40 / FP 0 / FN 11 / TP 15 (precision 1.0, recall 0.577, F1 0.732); campaigns detected</w:t>
+      </w:r>
+      <w:r>
+        <w:t xml:space="preserve"> </w:t>
+      </w:r>
+      <w:r>
+        <w:t xml:space="preserve">9/10, 9/9 of those passing through the middleware;</w:t>
+      </w:r>
+      <w:r>
+        <w:t xml:space="preserve"> </w:t>
+      </w:r>
+      <w:r>
+        <w:rPr>
+          <w:rStyle w:val="VerbatimChar"/>
+        </w:rPr>
+        <w:t xml:space="preserve">false-injection</w:t>
+      </w:r>
+      <w:r>
+        <w:t xml:space="preserve"> </w:t>
+      </w:r>
+      <w:r>
+        <w:t xml:space="preserve">bypasses the middleware (documented limit). The physical ML model is cold</w:t>
+      </w:r>
+      <w:r>
+        <w:t xml:space="preserve"> </w:t>
+      </w:r>
+      <w:r>
+        <w:t xml:space="preserve">during the campaign (120 s warm-up), so it measures the rules. Outputs: docs/reports/evidence_pack.md, benchmarks/evidence_pack.json,</w:t>
+      </w:r>
+      <w:r>
+        <w:t xml:space="preserve"> </w:t>
+      </w:r>
+      <w:r>
+        <w:t xml:space="preserve">docs/reports/figures/evidence_live_campaign.png, evidence_swat_heldout.png.</w:t>
+      </w:r>
+    </w:p>
+    <w:bookmarkEnd w:id="90"/>
+    <w:bookmarkStart w:id="91" w:name="Xf1e8fd2b260e3d8d6e3e8b311e8109072b4ac69"/>
+    <w:p>
+      <w:pPr>
+        <w:pStyle w:val="Heading2"/>
+      </w:pPr>
+      <w:r>
+        <w:t xml:space="preserve">Explaining the physical model’s verdict (no retraining)</w:t>
+      </w:r>
+    </w:p>
+    <w:p>
+      <w:pPr>
+        <w:pStyle w:val="FirstParagraph"/>
+      </w:pPr>
+      <w:r>
+        <w:rPr>
+          <w:rStyle w:val="VerbatimChar"/>
+        </w:rPr>
+        <w:t xml:space="preserve">models/explain.py</w:t>
+      </w:r>
+      <w:r>
+        <w:t xml:space="preserve"> </w:t>
+      </w:r>
+      <w:r>
+        <w:t xml:space="preserve">turns one probability into a sentence. The 18 live channels (10 sensors, 8 actuators) are grouped by plant stage;</w:t>
+      </w:r>
+      <w:r>
+        <w:t xml:space="preserve"> </w:t>
+      </w:r>
+      <w:r>
+        <w:t xml:space="preserve">when the model flags, the 120 s window is rebuilt five times, each time with one stage’s RAW CHANNELS replaced by those of the most recent</w:t>
+      </w:r>
+      <w:r>
+        <w:t xml:space="preserve"> </w:t>
+      </w:r>
+      <w:r>
+        <w:t xml:space="preserve">window the model itself scored as normal, every feature is recomputed and the window is rescored. The drop in probability is that stage’s</w:t>
+      </w:r>
+      <w:r>
+        <w:t xml:space="preserve"> </w:t>
+      </w:r>
+      <w:r>
+        <w:t xml:space="preserve">contribution and the largest names</w:t>
+      </w:r>
+      <w:r>
+        <w:t xml:space="preserve"> </w:t>
+      </w:r>
+      <w:r>
+        <w:rPr>
+          <w:rStyle w:val="VerbatimChar"/>
+        </w:rPr>
+        <w:t xml:space="preserve">suspect_stage</w:t>
+      </w:r>
+      <w:r>
+        <w:t xml:space="preserve">. Swapping raw channels rather than feature columns is essential: several features</w:t>
+      </w:r>
+      <w:r>
+        <w:t xml:space="preserve"> </w:t>
+      </w:r>
+      <w:r>
+        <w:t xml:space="preserve">(</w:t>
+      </w:r>
+      <w:r>
+        <w:rPr>
+          <w:rStyle w:val="VerbatimChar"/>
+        </w:rPr>
+        <w:t xml:space="preserve">sensors_outside_envelope</w:t>
+      </w:r>
+      <w:r>
+        <w:t xml:space="preserve">,</w:t>
+      </w:r>
+      <w:r>
+        <w:t xml:space="preserve"> </w:t>
+      </w:r>
+      <w:r>
+        <w:rPr>
+          <w:rStyle w:val="VerbatimChar"/>
+        </w:rPr>
+        <w:t xml:space="preserve">max_envelope_excess</w:t>
+      </w:r>
+      <w:r>
+        <w:t xml:space="preserve">,</w:t>
+      </w:r>
+      <w:r>
+        <w:t xml:space="preserve"> </w:t>
+      </w:r>
+      <w:r>
+        <w:rPr>
+          <w:rStyle w:val="VerbatimChar"/>
+        </w:rPr>
+        <w:t xml:space="preserve">resid_abs_*</w:t>
+      </w:r>
+      <w:r>
+        <w:t xml:space="preserve">) summarise the whole plant, so editing columns leaves them stale and the</w:t>
+      </w:r>
+      <w:r>
+        <w:t xml:space="preserve"> </w:t>
+      </w:r>
+      <w:r>
+        <w:t xml:space="preserve">attribution collapses onto them. The explanation is contrastive (</w:t>
+      </w:r>
+      <w:r>
+        <w:t xml:space="preserve">“</w:t>
+      </w:r>
+      <w:r>
+        <w:t xml:space="preserve">what changed since the plant last looked fine</w:t>
+      </w:r>
+      <w:r>
+        <w:t xml:space="preserve">”</w:t>
+      </w:r>
+      <w:r>
+        <w:t xml:space="preserve">), needs no training data at</w:t>
+      </w:r>
+      <w:r>
+        <w:t xml:space="preserve"> </w:t>
+      </w:r>
+      <w:r>
+        <w:t xml:space="preserve">run time, costs about 2-3 ms, and runs only on a flag. Measured on synthetic single-sensor spoofs it names S1, S3 and S5 correctly with the</w:t>
+      </w:r>
+      <w:r>
+        <w:t xml:space="preserve"> </w:t>
+      </w:r>
+      <w:r>
+        <w:t xml:space="preserve">driving stage contributing 0.6-0.9 probability while the others stay within +/-0.02.</w:t>
+      </w:r>
+    </w:p>
+    <w:p>
+      <w:pPr>
+        <w:pStyle w:val="BodyText"/>
+      </w:pPr>
+      <w:r>
+        <w:t xml:space="preserve">Each assessment also reports the three sensors furthest from measured normal (z-score, direction, whether outside the measured envelope),</w:t>
+      </w:r>
+      <w:r>
+        <w:t xml:space="preserve"> </w:t>
+      </w:r>
+      <w:r>
+        <w:rPr>
+          <w:rStyle w:val="VerbatimChar"/>
+        </w:rPr>
+        <w:t xml:space="preserve">confidence</w:t>
+      </w:r>
+      <w:r>
+        <w:t xml:space="preserve"> </w:t>
+      </w:r>
+      <w:r>
+        <w:t xml:space="preserve">(</w:t>
+      </w:r>
+      <w:r>
+        <w:rPr>
+          <w:rStyle w:val="VerbatimChar"/>
+        </w:rPr>
+        <w:t xml:space="preserve">marginal</w:t>
+      </w:r>
+      <w:r>
+        <w:t xml:space="preserve"> </w:t>
+      </w:r>
+      <w:r>
+        <w:t xml:space="preserve">when the probability is within 0.05 of the threshold),</w:t>
+      </w:r>
+      <w:r>
+        <w:t xml:space="preserve"> </w:t>
+      </w:r>
+      <w:r>
+        <w:rPr>
+          <w:rStyle w:val="VerbatimChar"/>
+        </w:rPr>
+        <w:t xml:space="preserve">reference_age_s</w:t>
+      </w:r>
+      <w:r>
+        <w:t xml:space="preserve"> </w:t>
+      </w:r>
+      <w:r>
+        <w:t xml:space="preserve">and</w:t>
+      </w:r>
+      <w:r>
+        <w:t xml:space="preserve"> </w:t>
+      </w:r>
+      <w:r>
+        <w:rPr>
+          <w:rStyle w:val="VerbatimChar"/>
+        </w:rPr>
+        <w:t xml:space="preserve">warmup_remaining_s</w:t>
+      </w:r>
+      <w:r>
+        <w:t xml:space="preserve">.</w:t>
+      </w:r>
+      <w:r>
+        <w:t xml:space="preserve"> </w:t>
+      </w:r>
+      <w:r>
+        <w:rPr>
+          <w:rStyle w:val="VerbatimChar"/>
+        </w:rPr>
+        <w:t xml:space="preserve">suspect_stage</w:t>
+      </w:r>
+      <w:r>
+        <w:t xml:space="preserve"> </w:t>
+      </w:r>
+      <w:r>
+        <w:t xml:space="preserve">reaches the ALERT reason (</w:t>
+      </w:r>
+      <w:r>
+        <w:rPr>
+          <w:rStyle w:val="VerbatimChar"/>
+        </w:rPr>
+        <w:t xml:space="preserve">PHYSICAL_MODEL:classifier S3</w:t>
+      </w:r>
+      <w:r>
+        <w:t xml:space="preserve">), the fusion record, the packet tracer and the blocked-attack log.</w:t>
+      </w:r>
+    </w:p>
+    <w:p>
+      <w:pPr>
+        <w:pStyle w:val="BodyText"/>
+      </w:pPr>
+      <w:r>
+        <w:rPr>
+          <w:rStyle w:val="VerbatimChar"/>
+        </w:rPr>
+        <w:t xml:space="preserve">models/operating_points.py</w:t>
+      </w:r>
+      <w:r>
+        <w:t xml:space="preserve"> </w:t>
+      </w:r>
+      <w:r>
+        <w:t xml:space="preserve">exposes named operating points read from the held-out report, never invented:</w:t>
+      </w:r>
+      <w:r>
+        <w:t xml:space="preserve"> </w:t>
+      </w:r>
+      <w:r>
+        <w:rPr>
+          <w:rStyle w:val="VerbatimChar"/>
+        </w:rPr>
+        <w:t xml:space="preserve">balanced</w:t>
+      </w:r>
+      <w:r>
+        <w:t xml:space="preserve"> </w:t>
+      </w:r>
+      <w:r>
+        <w:t xml:space="preserve">(shipped, 0.5/h budget,</w:t>
+      </w:r>
+      <w:r>
+        <w:t xml:space="preserve"> </w:t>
+      </w:r>
+      <w:r>
+        <w:t xml:space="preserve">threshold 0.7880, measured 1.17 alerts/h, 8/10 segments, F1 0.485) and</w:t>
+      </w:r>
+      <w:r>
+        <w:t xml:space="preserve"> </w:t>
+      </w:r>
+      <w:r>
+        <w:rPr>
+          <w:rStyle w:val="VerbatimChar"/>
+        </w:rPr>
+        <w:t xml:space="preserve">sensitive</w:t>
+      </w:r>
+      <w:r>
+        <w:t xml:space="preserve"> </w:t>
+      </w:r>
+      <w:r>
+        <w:t xml:space="preserve">(1.0/h budget, threshold 0.6895, 2.0 alerts/h, recall 0.563,</w:t>
+      </w:r>
+      <w:r>
+        <w:t xml:space="preserve"> </w:t>
+      </w:r>
+      <w:r>
+        <w:t xml:space="preserve">F1 0.468), selected with</w:t>
+      </w:r>
+      <w:r>
+        <w:t xml:space="preserve"> </w:t>
+      </w:r>
+      <w:r>
+        <w:rPr>
+          <w:rStyle w:val="VerbatimChar"/>
+        </w:rPr>
+        <w:t xml:space="preserve">IM_PHYSICAL_SENSITIVITY</w:t>
+      </w:r>
+      <w:r>
+        <w:t xml:space="preserve">;</w:t>
+      </w:r>
+      <w:r>
+        <w:t xml:space="preserve"> </w:t>
+      </w:r>
+      <w:r>
+        <w:rPr>
+          <w:rStyle w:val="VerbatimChar"/>
+        </w:rPr>
+        <w:t xml:space="preserve">IM_PHYSICAL_THRESHOLD</w:t>
+      </w:r>
+      <w:r>
+        <w:t xml:space="preserve"> </w:t>
+      </w:r>
+      <w:r>
+        <w:t xml:space="preserve">still overrides with a raw number.</w:t>
+      </w:r>
+      <w:r>
+        <w:t xml:space="preserve"> </w:t>
+      </w:r>
+      <w:r>
+        <w:rPr>
+          <w:rStyle w:val="VerbatimChar"/>
+        </w:rPr>
+        <w:t xml:space="preserve">model_card()</w:t>
+      </w:r>
+      <w:r>
+        <w:t xml:space="preserve"> </w:t>
+      </w:r>
+      <w:r>
+        <w:t xml:space="preserve">and</w:t>
+      </w:r>
+      <w:r>
+        <w:t xml:space="preserve"> </w:t>
+      </w:r>
+      <w:r>
+        <w:rPr>
+          <w:rStyle w:val="VerbatimChar"/>
+        </w:rPr>
+        <w:t xml:space="preserve">docs/MODEL_CARD.md</w:t>
+      </w:r>
+      <w:r>
+        <w:t xml:space="preserve"> </w:t>
+      </w:r>
+      <w:r>
+        <w:t xml:space="preserve">state what the model is, its measured performance and its known limits; the middleware publishes the card to the</w:t>
+      </w:r>
+      <w:r>
+        <w:t xml:space="preserve"> </w:t>
+      </w:r>
+      <w:r>
+        <w:t xml:space="preserve">dashboard at startup (</w:t>
+      </w:r>
+      <w:r>
+        <w:rPr>
+          <w:rStyle w:val="VerbatimChar"/>
+        </w:rPr>
+        <w:t xml:space="preserve">/api/model</w:t>
+      </w:r>
+      <w:r>
+        <w:t xml:space="preserve">) so the panel describes the model that is actually running. Tests:</w:t>
+      </w:r>
+      <w:r>
+        <w:t xml:space="preserve"> </w:t>
+      </w:r>
+      <w:r>
+        <w:rPr>
+          <w:rStyle w:val="VerbatimChar"/>
+        </w:rPr>
+        <w:t xml:space="preserve">tests/test_physical_explain.py</w:t>
+      </w:r>
+      <w:r>
+        <w:t xml:space="preserve">.</w:t>
+      </w:r>
+    </w:p>
+    <w:bookmarkEnd w:id="91"/>
+    <w:bookmarkStart w:id="92" w:name="Xc96df32489236d16364d1a2e3f3b0021f4acbd3"/>
+    <w:p>
+      <w:pPr>
+        <w:pStyle w:val="Heading2"/>
+      </w:pPr>
+      <w:r>
+        <w:t xml:space="preserve">End-to-end system-flow verification (four laptops, simulated and captured)</w:t>
+      </w:r>
+    </w:p>
+    <w:p>
+      <w:pPr>
+        <w:pStyle w:val="FirstParagraph"/>
+      </w:pPr>
+      <w:r>
+        <w:rPr>
+          <w:rStyle w:val="VerbatimChar"/>
+        </w:rPr>
+        <w:t xml:space="preserve">tools/sim_four_laptops.py</w:t>
+      </w:r>
+      <w:r>
+        <w:t xml:space="preserve"> </w:t>
+      </w:r>
+      <w:r>
+        <w:t xml:space="preserve">runs the complete demo on a single machine with each role on its own loopback address, so the cyber agent</w:t>
+      </w:r>
+      <w:r>
+        <w:t xml:space="preserve"> </w:t>
+      </w:r>
+      <w:r>
+        <w:t xml:space="preserve">genuinely sees four distinct peers: 127.0.0.1 middleware + dashboard, 127.0.0.2 PLC twin, 127.0.0.3 SCADA operator (trusted),</w:t>
+      </w:r>
+      <w:r>
+        <w:t xml:space="preserve"> </w:t>
+      </w:r>
+      <w:r>
+        <w:t xml:space="preserve">127.0.0.4 attacker (trusted segment, malicious), 127.0.0.9 rogue (untrusted). Nine phases run over real Modbus/TCP while tshark</w:t>
+      </w:r>
+      <w:r>
+        <w:t xml:space="preserve"> </w:t>
+      </w:r>
+      <w:r>
+        <w:t xml:space="preserve">captures both legs to TSV and to a pcapng. The tool then cross-checks four independent records of the same traffic - packet capture,</w:t>
+      </w:r>
+      <w:r>
+        <w:t xml:space="preserve"> </w:t>
+      </w:r>
+      <w:r>
+        <w:t xml:space="preserve">Packet Tracer, blocked-attack log, dashboard flow - matching wire frames to tracer entries by the 64-bit frame nonce (the tx_id is</w:t>
+      </w:r>
+      <w:r>
+        <w:t xml:space="preserve"> </w:t>
+      </w:r>
+      <w:r>
+        <w:t xml:space="preserve">generated inside the middleware and never appears on the wire).</w:t>
+      </w:r>
+    </w:p>
+    <w:p>
+      <w:pPr>
+        <w:pStyle w:val="BodyText"/>
+      </w:pPr>
+      <w:r>
+        <w:t xml:space="preserve">Recorded result (docs/reports/system_flow_verification.md): 24 signed frames captured, 24 consistent with the tracer, 0 mismatches.</w:t>
+      </w:r>
+      <w:r>
+        <w:t xml:space="preserve"> </w:t>
+      </w:r>
+      <w:r>
+        <w:t xml:space="preserve">Every DROP (forged HMAC, out-of-bounds, replay, five rate-limit frames, unsigned, untrusted source, cross-register) is present on the</w:t>
+      </w:r>
+      <w:r>
+        <w:t xml:space="preserve"> </w:t>
+      </w:r>
+      <w:r>
+        <w:t xml:space="preserve">middleware leg and absent from the PLC leg; every PASS and ALERT is present on both. The single direct-to-PLC write from the attacker</w:t>
+      </w:r>
+      <w:r>
+        <w:t xml:space="preserve"> </w:t>
+      </w:r>
+      <w:r>
+        <w:t xml:space="preserve">appears on the PLC leg only, confirming the documented limit of an inline control. Each DROP produces exactly one blocked-attack-log</w:t>
+      </w:r>
+      <w:r>
+        <w:t xml:space="preserve"> </w:t>
+      </w:r>
+      <w:r>
+        <w:t xml:space="preserve">record and the events correlate into per-source incidents. A Modbus-level response is still returned to the sender on a DROP (the</w:t>
+      </w:r>
+      <w:r>
+        <w:t xml:space="preserve"> </w:t>
+      </w:r>
+      <w:r>
+        <w:t xml:space="preserve">frame write itself is accepted by the datastore); what does not happen is the forward to the PLC, so no PLC response follows.</w:t>
+      </w:r>
+    </w:p>
+    <w:bookmarkEnd w:id="92"/>
+    <w:bookmarkStart w:id="93" w:name="X1241b21f74508707713f2dd9ec7072aa58bf017"/>
+    <w:p>
+      <w:pPr>
+        <w:pStyle w:val="Heading2"/>
+      </w:pPr>
+      <w:r>
+        <w:t xml:space="preserve">The investigation layer (opt-in LLM agent, out of band)</w:t>
+      </w:r>
+    </w:p>
+    <w:p>
+      <w:pPr>
+        <w:pStyle w:val="FirstParagraph"/>
+      </w:pPr>
+      <w:r>
+        <w:t xml:space="preserve">Design principle: an LLM-powered agent still uses code and rules. Authentication, access control and the hard safety limits stay</w:t>
+      </w:r>
+      <w:r>
+        <w:t xml:space="preserve"> </w:t>
+      </w:r>
+      <w:r>
+        <w:t xml:space="preserve">deterministic; what stops being a fixed chain of if/else statements is the investigation and decision workflow above them.</w:t>
+      </w:r>
+    </w:p>
+    <w:p>
+      <w:pPr>
+        <w:pStyle w:val="BodyText"/>
+      </w:pPr>
+      <w:r>
+        <w:rPr>
+          <w:rStyle w:val="VerbatimChar"/>
+        </w:rPr>
+        <w:t xml:space="preserve">middleware/investigator.py</w:t>
+      </w:r>
+      <w:r>
+        <w:t xml:space="preserve"> </w:t>
+      </w:r>
+      <w:r>
+        <w:t xml:space="preserve">implements exactly that split. The pipeline’s verdict is unchanged and unchangeable: the investigator</w:t>
+      </w:r>
+      <w:r>
+        <w:t xml:space="preserve"> </w:t>
+      </w:r>
+      <w:r>
+        <w:t xml:space="preserve">is triggered from</w:t>
+      </w:r>
+      <w:r>
+        <w:t xml:space="preserve"> </w:t>
+      </w:r>
+      <w:r>
+        <w:rPr>
+          <w:rStyle w:val="VerbatimChar"/>
+        </w:rPr>
+        <w:t xml:space="preserve">_respond</w:t>
+      </w:r>
+      <w:r>
+        <w:t xml:space="preserve"> </w:t>
+      </w:r>
+      <w:r>
+        <w:t xml:space="preserve">AFTER the decision has been published, runs in a worker thread, and produces a report. Its evidence</w:t>
+      </w:r>
+      <w:r>
+        <w:t xml:space="preserve"> </w:t>
+      </w:r>
+      <w:r>
+        <w:t xml:space="preserve">tools are read-only accessors over records this process already holds (incident, per-command traces, plant state and the physical</w:t>
+      </w:r>
+      <w:r>
+        <w:t xml:space="preserve"> </w:t>
+      </w:r>
+      <w:r>
+        <w:t xml:space="preserve">model’s explanation, the rule catalogue, live policy and quarantine settings, the model card, the blocked-attack log); the model</w:t>
+      </w:r>
+      <w:r>
+        <w:t xml:space="preserve"> </w:t>
+      </w:r>
+      <w:r>
+        <w:t xml:space="preserve">chooses which to call and in what order, which is the part a fixed rule chain cannot do, and every call is recorded so a finding</w:t>
+      </w:r>
+      <w:r>
+        <w:t xml:space="preserve"> </w:t>
+      </w:r>
+      <w:r>
+        <w:t xml:space="preserve">can be audited back to the evidence it rests on.</w:t>
+      </w:r>
+    </w:p>
+    <w:p>
+      <w:pPr>
+        <w:pStyle w:val="BodyText"/>
+      </w:pPr>
+      <w:r>
+        <w:t xml:space="preserve">Containment is in code, not in the prompt: recommendations are validated against a fixed allow-list (</w:t>
+      </w:r>
+      <w:r>
+        <w:rPr>
+          <w:rStyle w:val="VerbatimChar"/>
+        </w:rPr>
+        <w:t xml:space="preserve">ACTIONS</w:t>
+      </w:r>
+      <w:r>
+        <w:t xml:space="preserve">) and anything</w:t>
+      </w:r>
+      <w:r>
+        <w:t xml:space="preserve"> </w:t>
+      </w:r>
+      <w:r>
+        <w:t xml:space="preserve">invented is dropped into</w:t>
+      </w:r>
+      <w:r>
+        <w:t xml:space="preserve"> </w:t>
+      </w:r>
+      <w:r>
+        <w:rPr>
+          <w:rStyle w:val="VerbatimChar"/>
+        </w:rPr>
+        <w:t xml:space="preserve">rejected_actions</w:t>
+      </w:r>
+      <w:r>
+        <w:t xml:space="preserve"> </w:t>
+      </w:r>
+      <w:r>
+        <w:t xml:space="preserve">rather than executed; every recommendation is marked</w:t>
+      </w:r>
+      <w:r>
+        <w:t xml:space="preserve"> </w:t>
+      </w:r>
+      <w:r>
+        <w:rPr>
+          <w:rStyle w:val="VerbatimChar"/>
+        </w:rPr>
+        <w:t xml:space="preserve">requires_human_approval</w:t>
+      </w:r>
+      <w:r>
+        <w:t xml:space="preserve"> </w:t>
+      </w:r>
+      <w:r>
+        <w:t xml:space="preserve">and</w:t>
+      </w:r>
+      <w:r>
+        <w:t xml:space="preserve"> </w:t>
+      </w:r>
+      <w:r>
+        <w:rPr>
+          <w:rStyle w:val="VerbatimChar"/>
+        </w:rPr>
+        <w:t xml:space="preserve">applied: false</w:t>
+      </w:r>
+      <w:r>
+        <w:t xml:space="preserve">, and the dashboard panel has no Apply control; turns, tool calls and tokens are capped; tool results are wrapped</w:t>
+      </w:r>
+      <w:r>
+        <w:t xml:space="preserve"> </w:t>
+      </w:r>
+      <w:r>
+        <w:t xml:space="preserve">as</w:t>
+      </w:r>
+      <w:r>
+        <w:t xml:space="preserve"> </w:t>
+      </w:r>
+      <w:r>
+        <w:rPr>
+          <w:rStyle w:val="VerbatimChar"/>
+        </w:rPr>
+        <w:t xml:space="preserve">untrusted_evidence</w:t>
+      </w:r>
+      <w:r>
+        <w:t xml:space="preserve"> </w:t>
+      </w:r>
+      <w:r>
+        <w:t xml:space="preserve">because register values, source addresses and reason strings are attacker-influenced, and the system</w:t>
+      </w:r>
+      <w:r>
+        <w:t xml:space="preserve"> </w:t>
+      </w:r>
+      <w:r>
+        <w:t xml:space="preserve">prompt states that instructions found inside evidence are themselves evidence of manipulation. If the SDK, the API key or the</w:t>
+      </w:r>
+      <w:r>
+        <w:t xml:space="preserve"> </w:t>
+      </w:r>
+      <w:r>
+        <w:t xml:space="preserve">network is missing - or anything at all fails -</w:t>
+      </w:r>
+      <w:r>
+        <w:t xml:space="preserve"> </w:t>
+      </w:r>
+      <w:r>
+        <w:rPr>
+          <w:rStyle w:val="VerbatimChar"/>
+        </w:rPr>
+        <w:t xml:space="preserve">offline_finding()</w:t>
+      </w:r>
+      <w:r>
+        <w:t xml:space="preserve"> </w:t>
+      </w:r>
+      <w:r>
+        <w:t xml:space="preserve">writes the same finding shape deterministically and the system</w:t>
+      </w:r>
+      <w:r>
+        <w:t xml:space="preserve"> </w:t>
+      </w:r>
+      <w:r>
+        <w:t xml:space="preserve">behaves exactly as it did before. The agent loop is written out rather than delegated to the SDK’s tool runner so that the caps</w:t>
+      </w:r>
+      <w:r>
+        <w:t xml:space="preserve"> </w:t>
+      </w:r>
+      <w:r>
+        <w:t xml:space="preserve">and the audit trail are explicit.</w:t>
+      </w:r>
+    </w:p>
+    <w:p>
+      <w:pPr>
+        <w:pStyle w:val="BodyText"/>
+      </w:pPr>
+      <w:r>
+        <w:t xml:space="preserve">Model:</w:t>
+      </w:r>
+      <w:r>
+        <w:t xml:space="preserve"> </w:t>
+      </w:r>
+      <w:r>
+        <w:rPr>
+          <w:rStyle w:val="VerbatimChar"/>
+        </w:rPr>
+        <w:t xml:space="preserve">claude-opus-5-5</w:t>
+      </w:r>
+      <w:r>
+        <w:t xml:space="preserve"> </w:t>
+      </w:r>
+      <w:r>
+        <w:t xml:space="preserve">with adaptive thinking and server-side refusal fallbacks (the evidence describes cyberattacks on a plant,</w:t>
+      </w:r>
+      <w:r>
+        <w:t xml:space="preserve"> </w:t>
+      </w:r>
+      <w:r>
+        <w:t xml:space="preserve">which a safety classifier may decline). Opt in with</w:t>
+      </w:r>
+      <w:r>
+        <w:t xml:space="preserve"> </w:t>
+      </w:r>
+      <w:r>
+        <w:rPr>
+          <w:rStyle w:val="VerbatimChar"/>
+        </w:rPr>
+        <w:t xml:space="preserve">IM_INVESTIGATOR=1</w:t>
+      </w:r>
+      <w:r>
+        <w:t xml:space="preserve">; tune with</w:t>
+      </w:r>
+      <w:r>
+        <w:t xml:space="preserve"> </w:t>
+      </w:r>
+      <w:r>
+        <w:rPr>
+          <w:rStyle w:val="VerbatimChar"/>
+        </w:rPr>
+        <w:t xml:space="preserve">IM_INVESTIGATOR_MODEL</w:t>
+      </w:r>
+      <w:r>
+        <w:t xml:space="preserve">,</w:t>
+      </w:r>
+      <w:r>
+        <w:t xml:space="preserve"> </w:t>
+      </w:r>
+      <w:r>
+        <w:rPr>
+          <w:rStyle w:val="VerbatimChar"/>
+        </w:rPr>
+        <w:t xml:space="preserve">IM_INVESTIGATOR_EFFORT</w:t>
+      </w:r>
+      <w:r>
+        <w:t xml:space="preserve"> </w:t>
+      </w:r>
+      <w:r>
+        <w:t xml:space="preserve">and</w:t>
+      </w:r>
+      <w:r>
+        <w:t xml:space="preserve"> </w:t>
+      </w:r>
+      <w:r>
+        <w:rPr>
+          <w:rStyle w:val="VerbatimChar"/>
+        </w:rPr>
+        <w:t xml:space="preserve">IM_INVESTIGATOR_MIN_SEVERITY</w:t>
+      </w:r>
+      <w:r>
+        <w:t xml:space="preserve">.</w:t>
+      </w:r>
+      <w:r>
+        <w:t xml:space="preserve"> </w:t>
+      </w:r>
+      <w:r>
+        <w:rPr>
+          <w:rStyle w:val="VerbatimChar"/>
+        </w:rPr>
+        <w:t xml:space="preserve">anthropic</w:t>
+      </w:r>
+      <w:r>
+        <w:t xml:space="preserve"> </w:t>
+      </w:r>
+      <w:r>
+        <w:t xml:space="preserve">is an optional dependency. Run it by hand with</w:t>
+      </w:r>
+      <w:r>
+        <w:t xml:space="preserve"> </w:t>
+      </w:r>
+      <w:r>
+        <w:rPr>
+          <w:rStyle w:val="VerbatimChar"/>
+        </w:rPr>
+        <w:t xml:space="preserve">python -m tools.investigate --incident INC-0001 [--offline] [--publish]</w:t>
+      </w:r>
+      <w:r>
+        <w:t xml:space="preserve">. Tests:</w:t>
+      </w:r>
+      <w:r>
+        <w:t xml:space="preserve"> </w:t>
+      </w:r>
+      <w:r>
+        <w:rPr>
+          <w:rStyle w:val="VerbatimChar"/>
+        </w:rPr>
+        <w:t xml:space="preserve">tests/test_investigator.py</w:t>
+      </w:r>
+      <w:r>
+        <w:t xml:space="preserve">, whose stub client</w:t>
+      </w:r>
+      <w:r>
+        <w:t xml:space="preserve"> </w:t>
+      </w:r>
+      <w:r>
+        <w:t xml:space="preserve">exercises the real loop, caps, validation and injection resistance without a network call.</w:t>
+      </w:r>
+    </w:p>
+    <w:bookmarkEnd w:id="93"/>
+    <w:bookmarkStart w:id="94" w:name="X85a3d119a1fb869bc7a53f0da4ddec026cfd456"/>
+    <w:p>
+      <w:pPr>
+        <w:pStyle w:val="Heading2"/>
+      </w:pPr>
+      <w:r>
+        <w:t xml:space="preserve">Adversarial audit and hardening (after the evaluation above)</w:t>
+      </w:r>
+    </w:p>
+    <w:p>
+      <w:pPr>
+        <w:pStyle w:val="FirstParagraph"/>
+      </w:pPr>
+      <w:r>
+        <w:t xml:space="preserve">The system was reviewed adversarially (</w:t>
+      </w:r>
+      <w:r>
+        <w:rPr>
+          <w:rStyle w:val="VerbatimChar"/>
+        </w:rPr>
+        <w:t xml:space="preserve">final-results/AUDIT.md</w:t>
+      </w:r>
+      <w:r>
+        <w:t xml:space="preserve">); the pre-review state is frozen, never edited, in</w:t>
+      </w:r>
+      <w:r>
+        <w:t xml:space="preserve"> </w:t>
+      </w:r>
+      <w:r>
+        <w:rPr>
+          <w:rStyle w:val="VerbatimChar"/>
+        </w:rPr>
+        <w:t xml:space="preserve">final-results/before-review/</w:t>
+      </w:r>
+      <w:r>
+        <w:t xml:space="preserve">. The review found defects that all of the then-passing tests had missed, because they checked components against their own specification, not what an operator needs. Each fix is pinned by an operator-level test (</w:t>
+      </w:r>
+      <w:r>
+        <w:rPr>
+          <w:rStyle w:val="VerbatimChar"/>
+        </w:rPr>
+        <w:t xml:space="preserve">tests/test_audit_fixes.py</w:t>
+      </w:r>
+      <w:r>
+        <w:t xml:space="preserve">,</w:t>
+      </w:r>
+      <w:r>
+        <w:t xml:space="preserve"> </w:t>
+      </w:r>
+      <w:r>
+        <w:rPr>
+          <w:rStyle w:val="VerbatimChar"/>
+        </w:rPr>
+        <w:t xml:space="preserve">test_sprint_fixes.py</w:t>
+      </w:r>
+      <w:r>
+        <w:t xml:space="preserve">,</w:t>
+      </w:r>
+      <w:r>
+        <w:t xml:space="preserve"> </w:t>
+      </w:r>
+      <w:r>
+        <w:rPr>
+          <w:rStyle w:val="VerbatimChar"/>
+        </w:rPr>
+        <w:t xml:space="preserve">test_quarter_fixes.py</w:t>
+      </w:r>
+      <w:r>
+        <w:t xml:space="preserve">) and re-verified live (</w:t>
+      </w:r>
+      <w:r>
+        <w:rPr>
+          <w:rStyle w:val="VerbatimChar"/>
+        </w:rPr>
+        <w:t xml:space="preserve">final-results/_verify_fixes.py</w:t>
+      </w:r>
+      <w:r>
+        <w:t xml:space="preserve">, 14/14).</w:t>
+      </w:r>
+    </w:p>
+    <w:tbl>
+      <w:tblPr>
+        <w:tblStyle w:val="Table"/>
+        <w:tblW w:type="pct" w:w="5000"/>
+        <w:tblLook w:firstRow="1" w:lastRow="0" w:firstColumn="0" w:lastColumn="0" w:noHBand="0" w:noVBand="0" w:val="0020"/>
+        <w:jc w:val="start"/>
+      </w:tblPr>
+      <w:tblGrid>
+        <w:gridCol w:w="2640"/>
+        <w:gridCol w:w="2640"/>
+        <w:gridCol w:w="2640"/>
+      </w:tblGrid>
+      <w:tr>
+        <w:trPr>
+          <w:tblHeader w:val="true"/>
+        </w:trPr>
+        <w:tc>
+          <w:tcPr/>
+          <w:p>
+            <w:pPr>
+              <w:pStyle w:val="Compact"/>
+              <w:jc w:val="left"/>
+            </w:pPr>
+            <w:r>
+              <w:t xml:space="preserve">Finding</w:t>
+            </w:r>
+          </w:p>
+        </w:tc>
+        <w:tc>
+          <w:tcPr/>
+          <w:p>
+            <w:pPr>
+              <w:pStyle w:val="Compact"/>
+              <w:jc w:val="left"/>
+            </w:pPr>
+            <w:r>
+              <w:t xml:space="preserve">Before</w:t>
+            </w:r>
+          </w:p>
+        </w:tc>
+        <w:tc>
+          <w:tcPr/>
+          <w:p>
+            <w:pPr>
+              <w:pStyle w:val="Compact"/>
+              <w:jc w:val="left"/>
+            </w:pPr>
+            <w:r>
+              <w:t xml:space="preserve">After</w:t>
+            </w:r>
+          </w:p>
+        </w:tc>
+      </w:tr>
+      <w:tr>
+        <w:tc>
+          <w:tcPr/>
+          <w:p>
+            <w:pPr>
+              <w:pStyle w:val="Compact"/>
+              <w:jc w:val="left"/>
+            </w:pPr>
+            <w:r>
+              <w:t xml:space="preserve">C1 approved command never delivered</w:t>
+            </w:r>
+          </w:p>
+        </w:tc>
+        <w:tc>
+          <w:tcPr/>
+          <w:p>
+            <w:pPr>
+              <w:pStyle w:val="Compact"/>
+              <w:jc w:val="left"/>
+            </w:pPr>
+            <w:r>
+              <w:t xml:space="preserve">reported PASS</w:t>
+            </w:r>
+          </w:p>
+        </w:tc>
+        <w:tc>
+          <w:tcPr/>
+          <w:p>
+            <w:pPr>
+              <w:pStyle w:val="Compact"/>
+              <w:jc w:val="left"/>
+            </w:pPr>
+            <w:r>
+              <w:t xml:space="preserve">reported</w:t>
+            </w:r>
+            <w:r>
+              <w:t xml:space="preserve"> </w:t>
+            </w:r>
+            <w:r>
+              <w:rPr>
+                <w:rStyle w:val="VerbatimChar"/>
+              </w:rPr>
+              <w:t xml:space="preserve">UNDELIVERED</w:t>
+            </w:r>
+            <w:r>
+              <w:t xml:space="preserve">, moved out of the pass count</w:t>
+            </w:r>
+          </w:p>
+        </w:tc>
+      </w:tr>
+      <w:tr>
+        <w:tc>
+          <w:tcPr/>
+          <w:p>
+            <w:pPr>
+              <w:pStyle w:val="Compact"/>
+              <w:jc w:val="left"/>
+            </w:pPr>
+            <w:r>
+              <w:t xml:space="preserve">C2 unresponsive PLC stalls every client</w:t>
+            </w:r>
+          </w:p>
+        </w:tc>
+        <w:tc>
+          <w:tcPr/>
+          <w:p>
+            <w:pPr>
+              <w:pStyle w:val="Compact"/>
+              <w:jc w:val="left"/>
+            </w:pPr>
+            <w:r>
+              <w:t xml:space="preserve">2,002 ms per command</w:t>
+            </w:r>
+          </w:p>
+        </w:tc>
+        <w:tc>
+          <w:tcPr/>
+          <w:p>
+            <w:pPr>
+              <w:pStyle w:val="Compact"/>
+              <w:jc w:val="left"/>
+            </w:pPr>
+            <w:r>
+              <w:t xml:space="preserve">504 ms (bounded timeout), then 1.9 ms (forward moved off the event loop)</w:t>
+            </w:r>
+          </w:p>
+        </w:tc>
+      </w:tr>
+      <w:tr>
+        <w:tc>
+          <w:tcPr/>
+          <w:p>
+            <w:pPr>
+              <w:pStyle w:val="Compact"/>
+              <w:jc w:val="left"/>
+            </w:pPr>
+            <w:r>
+              <w:t xml:space="preserve">C3 library log flood in a 30 s outage</w:t>
+            </w:r>
+          </w:p>
+        </w:tc>
+        <w:tc>
+          <w:tcPr/>
+          <w:p>
+            <w:pPr>
+              <w:pStyle w:val="Compact"/>
+              <w:jc w:val="left"/>
+            </w:pPr>
+            <w:r>
+              <w:t xml:space="preserve">99 lines</w:t>
+            </w:r>
+          </w:p>
+        </w:tc>
+        <w:tc>
+          <w:tcPr/>
+          <w:p>
+            <w:pPr>
+              <w:pStyle w:val="Compact"/>
+              <w:jc w:val="left"/>
+            </w:pPr>
+            <w:r>
+              <w:t xml:space="preserve">1 line (filter attached to the handler, not the logger)</w:t>
+            </w:r>
+          </w:p>
+        </w:tc>
+      </w:tr>
+      <w:tr>
+        <w:tc>
+          <w:tcPr/>
+          <w:p>
+            <w:pPr>
+              <w:pStyle w:val="Compact"/>
+              <w:jc w:val="left"/>
+            </w:pPr>
+            <w:r>
+              <w:t xml:space="preserve">C4 poll retries a dead PLC</w:t>
+            </w:r>
+          </w:p>
+        </w:tc>
+        <w:tc>
+          <w:tcPr/>
+          <w:p>
+            <w:pPr>
+              <w:pStyle w:val="Compact"/>
+              <w:jc w:val="left"/>
+            </w:pPr>
+            <w:r>
+              <w:t xml:space="preserve">~18,000 attempts/hour</w:t>
+            </w:r>
+          </w:p>
+        </w:tc>
+        <w:tc>
+          <w:tcPr/>
+          <w:p>
+            <w:pPr>
+              <w:pStyle w:val="Compact"/>
+              <w:jc w:val="left"/>
+            </w:pPr>
+            <w:r>
+              <w:t xml:space="preserve">720 (exponential backoff to 5 s)</w:t>
+            </w:r>
+          </w:p>
+        </w:tc>
+      </w:tr>
+      <w:tr>
+        <w:tc>
+          <w:tcPr/>
+          <w:p>
+            <w:pPr>
+              <w:pStyle w:val="Compact"/>
+              <w:jc w:val="left"/>
+            </w:pPr>
+            <w:r>
+              <w:t xml:space="preserve">C5 replay check not atomic</w:t>
+            </w:r>
+          </w:p>
+        </w:tc>
+        <w:tc>
+          <w:tcPr/>
+          <w:p>
+            <w:pPr>
+              <w:pStyle w:val="Compact"/>
+              <w:jc w:val="left"/>
+            </w:pPr>
+            <w:r>
+              <w:t xml:space="preserve">unsynchronised</w:t>
+            </w:r>
+          </w:p>
+        </w:tc>
+        <w:tc>
+          <w:tcPr/>
+          <w:p>
+            <w:pPr>
+              <w:pStyle w:val="Compact"/>
+              <w:jc w:val="left"/>
+            </w:pPr>
+            <w:r>
+              <w:t xml:space="preserve">12 threads replaying one nonce: exactly 1 accepted</w:t>
+            </w:r>
+          </w:p>
+        </w:tc>
+      </w:tr>
+      <w:tr>
+        <w:tc>
+          <w:tcPr/>
+          <w:p>
+            <w:pPr>
+              <w:pStyle w:val="Compact"/>
+              <w:jc w:val="left"/>
+            </w:pPr>
+            <w:r>
+              <w:t xml:space="preserve">S1 PLC accepts writes from anything</w:t>
+            </w:r>
+          </w:p>
+        </w:tc>
+        <w:tc>
+          <w:tcPr/>
+          <w:p>
+            <w:pPr>
+              <w:pStyle w:val="Compact"/>
+              <w:jc w:val="left"/>
+            </w:pPr>
+            <w:r>
+              <w:t xml:space="preserve">bypass moves the plant</w:t>
+            </w:r>
+          </w:p>
+        </w:tc>
+        <w:tc>
+          <w:tcPr/>
+          <w:p>
+            <w:pPr>
+              <w:pStyle w:val="Compact"/>
+              <w:jc w:val="left"/>
+            </w:pPr>
+            <w:r>
+              <w:t xml:space="preserve">refused at the PLC, logged; default allow-list is the middleware host</w:t>
+            </w:r>
+          </w:p>
+        </w:tc>
+      </w:tr>
+      <w:tr>
+        <w:tc>
+          <w:tcPr/>
+          <w:p>
+            <w:pPr>
+              <w:pStyle w:val="Compact"/>
+              <w:jc w:val="left"/>
+            </w:pPr>
+            <w:r>
+              <w:t xml:space="preserve">S3 open dashboard on a network</w:t>
+            </w:r>
+          </w:p>
+        </w:tc>
+        <w:tc>
+          <w:tcPr/>
+          <w:p>
+            <w:pPr>
+              <w:pStyle w:val="Compact"/>
+              <w:jc w:val="left"/>
+            </w:pPr>
+            <w:r>
+              <w:t xml:space="preserve">POST endpoints unauthenticated</w:t>
+            </w:r>
+          </w:p>
+        </w:tc>
+        <w:tc>
+          <w:tcPr/>
+          <w:p>
+            <w:pPr>
+              <w:pStyle w:val="Compact"/>
+              <w:jc w:val="left"/>
+            </w:pPr>
+            <w:r>
+              <w:t xml:space="preserve">refuses to start off loopback without</w:t>
+            </w:r>
+            <w:r>
+              <w:t xml:space="preserve"> </w:t>
+            </w:r>
+            <w:r>
+              <w:rPr>
+                <w:rStyle w:val="VerbatimChar"/>
+              </w:rPr>
+              <w:t xml:space="preserve">IM_DASHBOARD_TOKEN</w:t>
+            </w:r>
+          </w:p>
+        </w:tc>
+      </w:tr>
+      <w:tr>
+        <w:tc>
+          <w:tcPr/>
+          <w:p>
+            <w:pPr>
+              <w:pStyle w:val="Compact"/>
+              <w:jc w:val="left"/>
+            </w:pPr>
+            <w:r>
+              <w:t xml:space="preserve">S4 quarantine keyed to source address</w:t>
+            </w:r>
+          </w:p>
+        </w:tc>
+        <w:tc>
+          <w:tcPr/>
+          <w:p>
+            <w:pPr>
+              <w:pStyle w:val="Compact"/>
+              <w:jc w:val="left"/>
+            </w:pPr>
+            <w:r>
+              <w:t xml:space="preserve">2 forged frames quarantine the real operator</w:t>
+            </w:r>
+          </w:p>
+        </w:tc>
+        <w:tc>
+          <w:tcPr/>
+          <w:p>
+            <w:pPr>
+              <w:pStyle w:val="Compact"/>
+              <w:jc w:val="left"/>
+            </w:pPr>
+            <w:r>
+              <w:t xml:space="preserve">strikes only from HMAC-authenticated commands; check runs after authentication</w:t>
+            </w:r>
+          </w:p>
+        </w:tc>
+      </w:tr>
+      <w:tr>
+        <w:tc>
+          <w:tcPr/>
+          <w:p>
+            <w:pPr>
+              <w:pStyle w:val="Compact"/>
+              <w:jc w:val="left"/>
+            </w:pPr>
+            <w:r>
+              <w:t xml:space="preserve">A4 forensic record in UI memory</w:t>
+            </w:r>
+          </w:p>
+        </w:tc>
+        <w:tc>
+          <w:tcPr/>
+          <w:p>
+            <w:pPr>
+              <w:pStyle w:val="Compact"/>
+              <w:jc w:val="left"/>
+            </w:pPr>
+            <w:r>
+              <w:t xml:space="preserve">lost on restart</w:t>
+            </w:r>
+          </w:p>
+        </w:tc>
+        <w:tc>
+          <w:tcPr/>
+          <w:p>
+            <w:pPr>
+              <w:pStyle w:val="Compact"/>
+              <w:jc w:val="left"/>
+            </w:pPr>
+            <w:r>
+              <w:t xml:space="preserve">append-only JSONL, replayed at startup; Reset sets files aside</w:t>
+            </w:r>
+          </w:p>
+        </w:tc>
+      </w:tr>
+      <w:tr>
+        <w:tc>
+          <w:tcPr/>
+          <w:p>
+            <w:pPr>
+              <w:pStyle w:val="Compact"/>
+              <w:jc w:val="left"/>
+            </w:pPr>
+            <w:r>
+              <w:t xml:space="preserve">A1/A2 1,478-line module, pipeline inside the storage hook</w:t>
+            </w:r>
+          </w:p>
+        </w:tc>
+        <w:tc>
+          <w:tcPr/>
+          <w:p>
+            <w:pPr>
+              <w:pStyle w:val="Compact"/>
+              <w:jc w:val="left"/>
+            </w:pPr>
+            <w:r>
+              <w:t xml:space="preserve">decision ran in</w:t>
+            </w:r>
+            <w:r>
+              <w:t xml:space="preserve"> </w:t>
+            </w:r>
+            <w:r>
+              <w:rPr>
+                <w:rStyle w:val="VerbatimChar"/>
+              </w:rPr>
+              <w:t xml:space="preserve">setValues</w:t>
+            </w:r>
+          </w:p>
+        </w:tc>
+        <w:tc>
+          <w:tcPr/>
+          <w:p>
+            <w:pPr>
+              <w:pStyle w:val="Compact"/>
+              <w:jc w:val="left"/>
+            </w:pPr>
+            <w:r>
+              <w:t xml:space="preserve">five modules; the hook enqueues; one ordered decision worker</w:t>
+            </w:r>
+          </w:p>
+        </w:tc>
+      </w:tr>
+      <w:tr>
+        <w:tc>
+          <w:tcPr/>
+          <w:p>
+            <w:pPr>
+              <w:pStyle w:val="Compact"/>
+              <w:jc w:val="left"/>
+            </w:pPr>
+            <w:r>
+              <w:t xml:space="preserve">N2 dashboard CDN assets</w:t>
+            </w:r>
+          </w:p>
+        </w:tc>
+        <w:tc>
+          <w:tcPr/>
+          <w:p>
+            <w:pPr>
+              <w:pStyle w:val="Compact"/>
+              <w:jc w:val="left"/>
+            </w:pPr>
+            <w:r>
+              <w:t xml:space="preserve">blank chart on an air-gapped lab</w:t>
+            </w:r>
+          </w:p>
+        </w:tc>
+        <w:tc>
+          <w:tcPr/>
+          <w:p>
+            <w:pPr>
+              <w:pStyle w:val="Compact"/>
+              <w:jc w:val="left"/>
+            </w:pPr>
+            <w:r>
+              <w:t xml:space="preserve">vendored chart and icons, zero console errors offline</w:t>
+            </w:r>
+          </w:p>
+        </w:tc>
+      </w:tr>
+    </w:tbl>
+    <w:p>
+      <w:pPr>
+        <w:pStyle w:val="BodyText"/>
+      </w:pPr>
+      <w:r>
+        <w:t xml:space="preserve">Code layout after the refactor: source modules live in</w:t>
+      </w:r>
+      <w:r>
+        <w:t xml:space="preserve"> </w:t>
+      </w:r>
+      <w:r>
+        <w:rPr>
+          <w:rStyle w:val="VerbatimChar"/>
+        </w:rPr>
+        <w:t xml:space="preserve">core/</w:t>
+      </w:r>
+      <w:r>
+        <w:t xml:space="preserve">, rejected experiments in</w:t>
+      </w:r>
+      <w:r>
+        <w:t xml:space="preserve"> </w:t>
+      </w:r>
+      <w:r>
+        <w:rPr>
+          <w:rStyle w:val="VerbatimChar"/>
+        </w:rPr>
+        <w:t xml:space="preserve">research/</w:t>
+      </w:r>
+      <w:r>
+        <w:t xml:space="preserve"> </w:t>
+      </w:r>
+      <w:r>
+        <w:t xml:space="preserve">(v3 physical model, learned fusion, cyber ML), and</w:t>
+      </w:r>
+      <w:r>
+        <w:t xml:space="preserve"> </w:t>
+      </w:r>
+      <w:r>
+        <w:rPr>
+          <w:rStyle w:val="VerbatimChar"/>
+        </w:rPr>
+        <w:t xml:space="preserve">docs/</w:t>
+      </w:r>
+      <w:r>
+        <w:t xml:space="preserve"> </w:t>
+      </w:r>
+      <w:r>
+        <w:t xml:space="preserve">is documentation only.</w:t>
+      </w:r>
+      <w:r>
+        <w:t xml:space="preserve"> </w:t>
+      </w:r>
+      <w:r>
+        <w:rPr>
+          <w:bCs/>
+          <w:b/>
+        </w:rPr>
+        <w:t xml:space="preserve">Caveats worth stating in a paper:</w:t>
+      </w:r>
+      <w:r>
+        <w:t xml:space="preserve"> </w:t>
+      </w:r>
+      <w:r>
+        <w:t xml:space="preserve">the PLC allow-list is defence in depth, not a substitute for segmentation (a spoofed source address still passes); the quarantine is spoof-proof only with per-device keys (</w:t>
+      </w:r>
+      <w:r>
+        <w:rPr>
+          <w:rStyle w:val="VerbatimChar"/>
+        </w:rPr>
+        <w:t xml:space="preserve">IM_HMAC_KEYS</w:t>
+      </w:r>
+      <w:r>
+        <w:t xml:space="preserve">); and the four-laptop deployment is verified on loopback addresses with a real capture, not yet on four physical machines.</w:t>
+      </w:r>
+    </w:p>
+    <w:bookmarkEnd w:id="94"/>
+    <w:bookmarkEnd w:id="95"/>
     <w:sectPr/>
   </w:body>
 </w:document>
@@ -19605,6 +21685,9 @@
     <w:lvlOverride w:ilvl="8">
       <w:startOverride w:val="1"/>
     </w:lvlOverride>
+  </w:num>
+  <w:num w:numId="1017">
+    <w:abstractNumId w:val="991"/>
   </w:num>
 </w:numbering>
 </file>

</xml_diff>

<commit_message>
Record the before/after measurement of the invariant rules on the twin
Full run (5 seeds, 25 actuator + 25 sensor-tampering runs, 9 healthy hours, interleaved latency):
sensor tampering 10/25 -> 20/25 detected, actuator attacks 25/25 -> 25/25, false-alarm episodes
0 -> 0, no measurable decision-latency change. Twin measurement, not SWaT. Docs and index updated;
full suite 38 scripts, 1,018 checks.

Co-Authored-By: Claude Sonnet 5.5 <noreply@anthropic.com>
Claude-Session: https://claude.ai/code/session_01CCaa5ryDCYmdUxSsXWXtH1
</commit_message>
<xml_diff>
--- a/docs/PROJECT_DETAILS.docx
+++ b/docs/PROJECT_DETAILS.docx
@@ -21722,6 +21722,61 @@
       </w:r>
       <w:r>
         <w:t xml:space="preserve">.</w:t>
+      </w:r>
+    </w:p>
+    <w:p>
+      <w:pPr>
+        <w:pStyle w:val="BodyText"/>
+      </w:pPr>
+      <w:r>
+        <w:rPr>
+          <w:bCs/>
+          <w:b/>
+        </w:rPr>
+        <w:t xml:space="preserve">Before/after of the invariant rules on the twin</w:t>
+      </w:r>
+      <w:r>
+        <w:t xml:space="preserve"> </w:t>
+      </w:r>
+      <w:r>
+        <w:t xml:space="preserve">(</w:t>
+      </w:r>
+      <w:r>
+        <w:rPr>
+          <w:rStyle w:val="VerbatimChar"/>
+        </w:rPr>
+        <w:t xml:space="preserve">python -m benchmark.invariants_ab</w:t>
+      </w:r>
+      <w:r>
+        <w:t xml:space="preserve">,</w:t>
+      </w:r>
+      <w:r>
+        <w:t xml:space="preserve"> </w:t>
+      </w:r>
+      <w:r>
+        <w:rPr>
+          <w:rStyle w:val="VerbatimChar"/>
+        </w:rPr>
+        <w:t xml:space="preserve">docs/reports/invariants_ab_report.md</w:t>
+      </w:r>
+      <w:r>
+        <w:t xml:space="preserve">; twin measurement, not SWaT). BEFORE = v2 model flag OR the measured-envelope rule; AFTER = plus the invariants; nothing else differs. Over 5 seeds: actuator attacks 25/25 detected both ways (the previous system already caught them, median 4 s);</w:t>
+      </w:r>
+      <w:r>
+        <w:t xml:space="preserve"> </w:t>
+      </w:r>
+      <w:r>
+        <w:rPr>
+          <w:bCs/>
+          <w:b/>
+        </w:rPr>
+        <w:t xml:space="preserve">sensor tampering 10/25 -&gt; 20/25</w:t>
+      </w:r>
+      <w:r>
+        <w:t xml:space="preserve"> </w:t>
+      </w:r>
+      <w:r>
+        <w:t xml:space="preserve">(a level jump and a dead flow meter, caught within about 1 s, that the model and envelope never flagged; a frozen level sensor is still missed by every source, and the invariants miss a flow-meter bias and a slow ramp that the previous system catches); false-alarm episodes per healthy hour 0.0 -&gt; 0.0 over 9 hours; decision latency p50 0.349 -&gt; 0.346 ms (interleaved, no measurable change; the monitor costs 0.53 ms per telemetry sample off the decision path and 0.5 microseconds per decision). The shipped v2 model and its SWaT numbers are unchanged by this build.</w:t>
       </w:r>
     </w:p>
     <w:bookmarkEnd w:id="96"/>

</xml_diff>

<commit_message>
Record the re-run before/after with the flatline rule; update docs
Sensor tampering 10/25 -> 25/25 detected on the twin (invariants alone 15/25; a flow-meter bias and a slow
ramp are caught only by the model/envelope), actuator attacks 25/25 -> 25/25, 0 false-alarm episodes in 9
healthy hours, no measurable decision-latency change. Disclosed in the report and docs: the flat rule was
added after the first run showed the frozen-sensor case missed, so that scenario is not independent
evidence. Campaign view documented. Full suite 38 scripts, 1,026 checks, all passing.

Co-Authored-By: Claude Sonnet 5.5 <noreply@anthropic.com>
Claude-Session: https://claude.ai/code/session_01CCaa5ryDCYmdUxSsXWXtH1
</commit_message>
<xml_diff>
--- a/docs/PROJECT_DETAILS.docx
+++ b/docs/PROJECT_DETAILS.docx
@@ -21760,23 +21760,94 @@
         <w:t xml:space="preserve">docs/reports/invariants_ab_report.md</w:t>
       </w:r>
       <w:r>
-        <w:t xml:space="preserve">; twin measurement, not SWaT). BEFORE = v2 model flag OR the measured-envelope rule; AFTER = plus the invariants; nothing else differs. Over 5 seeds: actuator attacks 25/25 detected both ways (the previous system already caught them, median 4 s);</w:t>
-      </w:r>
-      <w:r>
-        <w:t xml:space="preserve"> </w:t>
-      </w:r>
-      <w:r>
-        <w:rPr>
-          <w:bCs/>
-          <w:b/>
-        </w:rPr>
-        <w:t xml:space="preserve">sensor tampering 10/25 -&gt; 20/25</w:t>
-      </w:r>
-      <w:r>
-        <w:t xml:space="preserve"> </w:t>
-      </w:r>
-      <w:r>
-        <w:t xml:space="preserve">(a level jump and a dead flow meter, caught within about 1 s, that the model and envelope never flagged; a frozen level sensor is still missed by every source, and the invariants miss a flow-meter bias and a slow ramp that the previous system catches); false-alarm episodes per healthy hour 0.0 -&gt; 0.0 over 9 hours; decision latency p50 0.349 -&gt; 0.346 ms (interleaved, no measurable change; the monitor costs 0.53 ms per telemetry sample off the decision path and 0.5 microseconds per decision). The shipped v2 model and its SWaT numbers are unchanged by this build.</w:t>
+        <w:t xml:space="preserve">; twin measurement, not SWaT). BEFORE = v2 model flag OR the measured-envelope rule; AFTER = plus the invariants (four families: rate, state, balance, flat); nothing else differs. Over 5 seeds: actuator attacks 25/25 detected both ways (the previous system already caught them, median 4 s);</w:t>
+      </w:r>
+      <w:r>
+        <w:t xml:space="preserve"> </w:t>
+      </w:r>
+      <w:r>
+        <w:rPr>
+          <w:bCs/>
+          <w:b/>
+        </w:rPr>
+        <w:t xml:space="preserve">sensor tampering 10/25 -&gt; 25/25</w:t>
+      </w:r>
+      <w:r>
+        <w:t xml:space="preserve"> </w:t>
+      </w:r>
+      <w:r>
+        <w:t xml:space="preserve">(a level jump and a dead flow meter within about 1 s and a frozen level sensor within about 22 s, none of which the model or envelope flagged; the invariants alone catch 15/25, and a flow-meter bias and a slow ramp are caught only by the previous system); false-alarm episodes per healthy hour 0.0 -&gt; 0.0 over 9 hours; decision latency p50 0.435 -&gt; 0.449 ms (interleaved, no measurable change; the monitor costs 1.5 ms per telemetry sample off the decision path and 0.8 microseconds per decision).</w:t>
+      </w:r>
+      <w:r>
+        <w:t xml:space="preserve"> </w:t>
+      </w:r>
+      <w:r>
+        <w:rPr>
+          <w:bCs/>
+          <w:b/>
+        </w:rPr>
+        <w:t xml:space="preserve">Disclosed:</w:t>
+      </w:r>
+      <w:r>
+        <w:t xml:space="preserve"> </w:t>
+      </w:r>
+      <w:r>
+        <w:t xml:space="preserve">the flat family was added after the first run showed the frozen-sensor case missed, so that scenario is not independent evidence, and the five sensor attacks are our own construction. The shipped v2 model and its SWaT numbers are unchanged.</w:t>
+      </w:r>
+    </w:p>
+    <w:p>
+      <w:pPr>
+        <w:pStyle w:val="BodyText"/>
+      </w:pPr>
+      <w:r>
+        <w:rPr>
+          <w:bCs/>
+          <w:b/>
+        </w:rPr>
+        <w:t xml:space="preserve">Campaign view of the live run</w:t>
+      </w:r>
+      <w:r>
+        <w:t xml:space="preserve"> </w:t>
+      </w:r>
+      <w:r>
+        <w:t xml:space="preserve">(</w:t>
+      </w:r>
+      <w:r>
+        <w:rPr>
+          <w:rStyle w:val="VerbatimChar"/>
+        </w:rPr>
+        <w:t xml:space="preserve">docs/reports/evidence_pack.md</w:t>
+      </w:r>
+      <w:r>
+        <w:t xml:space="preserve">): command-level recall 0.58 counts the commands an attack is allowed to send before it is recognisable as misses. Read as campaigns: 9 of 9 attack campaigns through the middleware detected (slowest at its 6th command), 10 attack-labelled commands passed before the first flag (the first frames of a flood under the rate limit, the original of a replay, the individually safe early steps of a ramp),</w:t>
+      </w:r>
+      <w:r>
+        <w:t xml:space="preserve"> </w:t>
+      </w:r>
+      <w:r>
+        <w:rPr>
+          <w:bCs/>
+          <w:b/>
+        </w:rPr>
+        <w:t xml:space="preserve">0 passed after detection began</w:t>
+      </w:r>
+      <w:r>
+        <w:t xml:space="preserve">, 0 of 40 legitimate commands flagged.</w:t>
+      </w:r>
+      <w:r>
+        <w:t xml:space="preserve"> </w:t>
+      </w:r>
+      <w:r>
+        <w:rPr>
+          <w:rStyle w:val="VerbatimChar"/>
+        </w:rPr>
+        <w:t xml:space="preserve">false-injection</w:t>
+      </w:r>
+      <w:r>
+        <w:t xml:space="preserve"> </w:t>
+      </w:r>
+      <w:r>
+        <w:t xml:space="preserve">writes directly to the PLC and cannot be stopped inline (the PLC allow-list refuses it across hosts).</w:t>
       </w:r>
     </w:p>
     <w:bookmarkEnd w:id="96"/>

</xml_diff>